<commit_message>
feat: parse explicit dates, add subcategory descriptions, update doc header and menu indent
</commit_message>
<xml_diff>
--- a/test_estimate.docx
+++ b/test_estimate.docx
@@ -42,7 +42,7 @@
                     </pic:cNvPicPr>
                   </pic:nvPicPr>
                   <pic:blipFill>
-                    <a:blip r:embed="rId6"/>
+                    <a:blip r:embed="rId8"/>
                     <a:stretch>
                       <a:fillRect/>
                     </a:stretch>
@@ -124,8 +124,14 @@
     <w:p>
       <w:pPr>
         <w:pStyle w:val="Default"/>
+        <w:rPr>
+          <w:rFonts w:ascii="Open Sans Medium" w:hAnsi="Open Sans Medium" w:cs="Open Sans Medium"/>
+        </w:rPr>
       </w:pPr>
       <w:r>
+        <w:rPr>
+          <w:rFonts w:ascii="Open Sans Medium" w:hAnsi="Open Sans Medium" w:cs="Open Sans Medium"/>
+        </w:rPr>
         <w:t xml:space="preserve"> </w:t>
       </w:r>
     </w:p>
@@ -133,6 +139,7 @@
       <w:pPr>
         <w:pStyle w:val="Default"/>
         <w:rPr>
+          <w:rFonts w:ascii="Open Sans Medium" w:hAnsi="Open Sans Medium" w:cs="Open Sans Medium"/>
           <w:color w:val="612D4A"/>
           <w:sz w:val="57"/>
         </w:rPr>
@@ -140,6 +147,7 @@
       <w:proofErr w:type="spellStart"/>
       <w:r>
         <w:rPr>
+          <w:rFonts w:ascii="Open Sans Medium" w:hAnsi="Open Sans Medium" w:cs="Open Sans Medium"/>
           <w:b/>
           <w:color w:val="612D4A"/>
           <w:sz w:val="57"/>
@@ -149,6 +157,7 @@
       <w:proofErr w:type="spellEnd"/>
       <w:r>
         <w:rPr>
+          <w:rFonts w:ascii="Open Sans Medium" w:hAnsi="Open Sans Medium" w:cs="Open Sans Medium"/>
           <w:b/>
           <w:color w:val="612D4A"/>
           <w:sz w:val="57"/>
@@ -158,6 +167,7 @@
       <w:proofErr w:type="spellStart"/>
       <w:r>
         <w:rPr>
+          <w:rFonts w:ascii="Open Sans Medium" w:hAnsi="Open Sans Medium" w:cs="Open Sans Medium"/>
           <w:b/>
           <w:color w:val="612D4A"/>
           <w:sz w:val="57"/>
@@ -169,2140 +179,1848 @@
     <w:p>
       <w:pPr>
         <w:rPr>
-          <w:rFonts w:ascii="Georgia" w:hAnsi="Georgia"/>
+          <w:rFonts w:ascii="Open Sans Medium" w:hAnsi="Open Sans Medium" w:cs="Open Sans Medium"/>
           <w:b/>
           <w:sz w:val="56"/>
         </w:rPr>
       </w:pPr>
       <w:r>
         <w:rPr>
-          <w:rFonts w:ascii="Georgia" w:hAnsi="Georgia"/>
+          <w:rFonts w:ascii="Open Sans Medium" w:hAnsi="Open Sans Medium" w:cs="Open Sans Medium"/>
           <w:b/>
           <w:sz w:val="56"/>
         </w:rPr>
+        <w:lastRenderedPageBreak/>
         <w:br/>
       </w:r>
     </w:p>
-    <w:tbl>
-      <w:tblPr>
-        <w:tblW w:w="8890" w:type="dxa"/>
-        <w:tblLayout w:type="fixed"/>
-        <w:tblLook w:val="04A0" w:firstRow="1" w:lastRow="0" w:firstColumn="1" w:lastColumn="0" w:noHBand="0" w:noVBand="1"/>
-      </w:tblPr>
-      <w:tblGrid>
-        <w:gridCol w:w="3330"/>
-        <w:gridCol w:w="5560"/>
-      </w:tblGrid>
-      <w:tr>
-        <w:trPr>
-          <w:trHeight w:val="12863"/>
-        </w:trPr>
-        <w:tc>
-          <w:tcPr>
-            <w:tcW w:w="3330" w:type="dxa"/>
-          </w:tcPr>
-          <w:p>
-            <w:r>
-              <w:rPr>
-                <w:noProof/>
-              </w:rPr>
-              <w:lastRenderedPageBreak/>
-              <w:drawing>
-                <wp:anchor distT="0" distB="0" distL="0" distR="0" simplePos="0" relativeHeight="251661312" behindDoc="0" locked="0" layoutInCell="0" allowOverlap="1" wp14:anchorId="1EB35D64" wp14:editId="2D4F7D51">
-                  <wp:simplePos x="0" y="0"/>
-                  <wp:positionH relativeFrom="column">
-                    <wp:posOffset>-37465</wp:posOffset>
-                  </wp:positionH>
-                  <wp:positionV relativeFrom="paragraph">
-                    <wp:posOffset>-447040</wp:posOffset>
-                  </wp:positionV>
-                  <wp:extent cx="2397760" cy="1035685"/>
-                  <wp:effectExtent l="0" t="0" r="0" b="0"/>
-                  <wp:wrapTopAndBottom/>
-                  <wp:docPr id="2" name="Image2"/>
-                  <wp:cNvGraphicFramePr>
-                    <a:graphicFrameLocks xmlns:a="http://schemas.openxmlformats.org/drawingml/2006/main" noChangeAspect="1"/>
-                  </wp:cNvGraphicFramePr>
-                  <a:graphic xmlns:a="http://schemas.openxmlformats.org/drawingml/2006/main">
-                    <a:graphicData uri="http://schemas.openxmlformats.org/drawingml/2006/picture">
-                      <pic:pic xmlns:pic="http://schemas.openxmlformats.org/drawingml/2006/picture">
-                        <pic:nvPicPr>
-                          <pic:cNvPr id="2" name="Image2"/>
-                          <pic:cNvPicPr>
-                            <a:picLocks noChangeAspect="1" noChangeArrowheads="1"/>
-                          </pic:cNvPicPr>
-                        </pic:nvPicPr>
-                        <pic:blipFill>
-                          <a:blip r:embed="rId7"/>
-                          <a:stretch>
-                            <a:fillRect/>
-                          </a:stretch>
-                        </pic:blipFill>
-                        <pic:spPr bwMode="auto">
-                          <a:xfrm>
-                            <a:off x="0" y="0"/>
-                            <a:ext cx="2397760" cy="1035685"/>
-                          </a:xfrm>
-                          <a:prstGeom prst="rect">
-                            <a:avLst/>
-                          </a:prstGeom>
-                          <a:noFill/>
-                        </pic:spPr>
-                      </pic:pic>
-                    </a:graphicData>
-                  </a:graphic>
-                </wp:anchor>
-              </w:drawing>
-            </w:r>
-            <w:r>
-              <w:rPr>
-                <w:b/>
-                <w:i/>
-                <w:color w:val="612D4B"/>
-                <w:sz w:val="26"/>
-              </w:rPr>
-              <w:t>We create everlasting moments</w:t>
-            </w:r>
-          </w:p>
-          <w:p/>
-          <w:p>
-            <w:r>
-              <w:rPr>
-                <w:b/>
-                <w:color w:val="612D4B"/>
-                <w:sz w:val="24"/>
-              </w:rPr>
-              <w:t>Client</w:t>
-            </w:r>
-          </w:p>
-          <w:p>
-            <w:pPr>
-              <w:spacing w:after="40"/>
-              <w:rPr>
-                <w:rFonts w:ascii="Cambria" w:hAnsi="Cambria"/>
-                <w:color w:val="000000"/>
-                <w:sz w:val="18"/>
-              </w:rPr>
-            </w:pPr>
-            <w:r>
-              <w:rPr>
-                <w:rFonts w:ascii="Cambria" w:hAnsi="Cambria"/>
-                <w:color w:val="000000"/>
-                <w:sz w:val="18"/>
-              </w:rPr>
-              <w:t>Rafael Guzman</w:t>
-            </w:r>
-          </w:p>
-          <w:p>
-            <w:pPr>
-              <w:spacing w:after="40"/>
-            </w:pPr>
-            <w:r>
-              <w:rPr>
-                <w:sz w:val="20"/>
-              </w:rPr>
-              <w:t>Santo Domingo, DR</w:t>
-            </w:r>
-          </w:p>
-          <w:p>
-            <w:pPr>
-              <w:spacing w:after="40"/>
-            </w:pPr>
-            <w:r>
-              <w:rPr>
-                <w:sz w:val="20"/>
-              </w:rPr>
-              <w:t>rafael@example.com</w:t>
-            </w:r>
-          </w:p>
-          <w:p/>
-          <w:p>
-            <w:r>
-              <w:rPr>
-                <w:b/>
-                <w:color w:val="612D4B"/>
-                <w:sz w:val="24"/>
-              </w:rPr>
-              <w:t>Client Representative</w:t>
-            </w:r>
-          </w:p>
-          <w:p>
-            <w:pPr>
-              <w:spacing w:after="40"/>
-            </w:pPr>
-            <w:r>
-              <w:rPr>
-                <w:sz w:val="20"/>
-              </w:rPr>
-              <w:t>Jane Doe</w:t>
-            </w:r>
-          </w:p>
-          <w:p>
-            <w:pPr>
-              <w:spacing w:after="40"/>
-            </w:pPr>
-            <w:r>
-              <w:rPr>
-                <w:sz w:val="20"/>
-              </w:rPr>
-              <w:t>jane@business.com</w:t>
-            </w:r>
-          </w:p>
-          <w:p>
-            <w:pPr>
-              <w:spacing w:after="40"/>
-            </w:pPr>
-            <w:r>
-              <w:rPr>
-                <w:sz w:val="20"/>
-              </w:rPr>
-              <w:t>Ph: +1 555-0198</w:t>
-            </w:r>
-          </w:p>
-          <w:p/>
-          <w:p>
-            <w:r>
-              <w:rPr>
-                <w:b/>
-                <w:color w:val="612D4B"/>
-                <w:sz w:val="24"/>
-              </w:rPr>
-              <w:t>Event Details</w:t>
-            </w:r>
-          </w:p>
-          <w:p>
-            <w:pPr>
-              <w:spacing w:after="40"/>
-            </w:pPr>
-            <w:r>
-              <w:rPr>
-                <w:sz w:val="20"/>
-              </w:rPr>
-              <w:t>789 Event Center Blvd, NY</w:t>
-            </w:r>
-          </w:p>
-          <w:p>
-            <w:pPr>
-              <w:spacing w:after="40"/>
-            </w:pPr>
-            <w:r>
-              <w:rPr>
-                <w:sz w:val="20"/>
-              </w:rPr>
-              <w:t>Event Code: EV-2025-099</w:t>
-            </w:r>
-          </w:p>
-          <w:p>
-            <w:pPr>
-              <w:spacing w:after="40"/>
-            </w:pPr>
-            <w:r>
-              <w:rPr>
-                <w:sz w:val="20"/>
-              </w:rPr>
-              <w:t>Start: Saturday, October 14th 2025</w:t>
-            </w:r>
-          </w:p>
-          <w:p>
-            <w:pPr>
-              <w:spacing w:after="40"/>
-            </w:pPr>
-            <w:r>
-              <w:rPr>
-                <w:sz w:val="20"/>
-              </w:rPr>
-              <w:t>End: Sunday, October 15th 2025</w:t>
-            </w:r>
-          </w:p>
-          <w:p>
-            <w:pPr>
-              <w:spacing w:after="40"/>
-            </w:pPr>
-            <w:r>
-              <w:rPr>
-                <w:noProof/>
-              </w:rPr>
-              <w:drawing>
-                <wp:anchor distT="0" distB="0" distL="0" distR="0" simplePos="0" relativeHeight="251663360" behindDoc="1" locked="0" layoutInCell="0" allowOverlap="1" wp14:anchorId="4E78B577" wp14:editId="12AF6007">
-                  <wp:simplePos x="0" y="0"/>
-                  <wp:positionH relativeFrom="column">
-                    <wp:posOffset>150495</wp:posOffset>
-                  </wp:positionH>
-                  <wp:positionV relativeFrom="paragraph">
-                    <wp:posOffset>452755</wp:posOffset>
-                  </wp:positionV>
-                  <wp:extent cx="1169035" cy="962025"/>
-                  <wp:effectExtent l="0" t="0" r="0" b="9525"/>
-                  <wp:wrapTopAndBottom/>
-                  <wp:docPr id="1769595650" name="Image1"/>
-                  <wp:cNvGraphicFramePr>
-                    <a:graphicFrameLocks xmlns:a="http://schemas.openxmlformats.org/drawingml/2006/main" noChangeAspect="1"/>
-                  </wp:cNvGraphicFramePr>
-                  <a:graphic xmlns:a="http://schemas.openxmlformats.org/drawingml/2006/main">
-                    <a:graphicData uri="http://schemas.openxmlformats.org/drawingml/2006/picture">
-                      <pic:pic xmlns:pic="http://schemas.openxmlformats.org/drawingml/2006/picture">
-                        <pic:nvPicPr>
-                          <pic:cNvPr id="1" name="Image1"/>
-                          <pic:cNvPicPr>
-                            <a:picLocks noChangeAspect="1" noChangeArrowheads="1"/>
-                          </pic:cNvPicPr>
-                        </pic:nvPicPr>
-                        <pic:blipFill>
-                          <a:blip r:embed="rId6"/>
-                          <a:stretch>
-                            <a:fillRect/>
-                          </a:stretch>
-                        </pic:blipFill>
-                        <pic:spPr bwMode="auto">
-                          <a:xfrm>
-                            <a:off x="0" y="0"/>
-                            <a:ext cx="1169035" cy="962025"/>
-                          </a:xfrm>
-                          <a:prstGeom prst="rect">
-                            <a:avLst/>
-                          </a:prstGeom>
-                          <a:noFill/>
-                        </pic:spPr>
-                      </pic:pic>
-                    </a:graphicData>
-                  </a:graphic>
-                  <wp14:sizeRelH relativeFrom="margin">
-                    <wp14:pctWidth>0</wp14:pctWidth>
-                  </wp14:sizeRelH>
-                  <wp14:sizeRelV relativeFrom="margin">
-                    <wp14:pctHeight>0</wp14:pctHeight>
-                  </wp14:sizeRelV>
-                </wp:anchor>
-              </w:drawing>
-            </w:r>
-            <w:r>
-              <w:rPr>
-                <w:noProof/>
-              </w:rPr>
-              <w:drawing>
-                <wp:anchor distT="0" distB="0" distL="0" distR="0" simplePos="0" relativeHeight="251657216" behindDoc="0" locked="0" layoutInCell="0" allowOverlap="1" wp14:anchorId="7977CB17" wp14:editId="419B1597">
-                  <wp:simplePos x="0" y="0"/>
-                  <wp:positionH relativeFrom="column">
-                    <wp:posOffset>-58908</wp:posOffset>
-                  </wp:positionH>
-                  <wp:positionV relativeFrom="paragraph">
-                    <wp:posOffset>7260723</wp:posOffset>
-                  </wp:positionV>
-                  <wp:extent cx="1532890" cy="1261110"/>
-                  <wp:effectExtent l="0" t="0" r="0" b="0"/>
-                  <wp:wrapNone/>
-                  <wp:docPr id="3" name="Image1 Copy 1"/>
-                  <wp:cNvGraphicFramePr>
-                    <a:graphicFrameLocks xmlns:a="http://schemas.openxmlformats.org/drawingml/2006/main" noChangeAspect="1"/>
-                  </wp:cNvGraphicFramePr>
-                  <a:graphic xmlns:a="http://schemas.openxmlformats.org/drawingml/2006/main">
-                    <a:graphicData uri="http://schemas.openxmlformats.org/drawingml/2006/picture">
-                      <pic:pic xmlns:pic="http://schemas.openxmlformats.org/drawingml/2006/picture">
-                        <pic:nvPicPr>
-                          <pic:cNvPr id="3" name="Image1 Copy 1"/>
-                          <pic:cNvPicPr>
-                            <a:picLocks noChangeAspect="1" noChangeArrowheads="1"/>
-                          </pic:cNvPicPr>
-                        </pic:nvPicPr>
-                        <pic:blipFill>
-                          <a:blip r:embed="rId6"/>
-                          <a:stretch>
-                            <a:fillRect/>
-                          </a:stretch>
-                        </pic:blipFill>
-                        <pic:spPr bwMode="auto">
-                          <a:xfrm>
-                            <a:off x="0" y="0"/>
-                            <a:ext cx="1532890" cy="1261110"/>
-                          </a:xfrm>
-                          <a:prstGeom prst="rect">
-                            <a:avLst/>
-                          </a:prstGeom>
-                          <a:noFill/>
-                        </pic:spPr>
-                      </pic:pic>
-                    </a:graphicData>
-                  </a:graphic>
-                </wp:anchor>
-              </w:drawing>
-            </w:r>
-            <w:r>
-              <w:rPr>
-                <w:sz w:val="20"/>
-              </w:rPr>
-              <w:t>200 Guests</w:t>
-            </w:r>
-          </w:p>
-        </w:tc>
-        <w:tc>
-          <w:tcPr>
-            <w:tcW w:w="5560" w:type="dxa"/>
-          </w:tcPr>
-          <w:p/>
-          <w:p>
-            <w:pPr>
-              <w:rPr>
-                <w:sz w:val="24"/>
-              </w:rPr>
-            </w:pPr>
-          </w:p>
-          <w:p>
-            <w:pPr>
-              <w:rPr>
-                <w:sz w:val="24"/>
-              </w:rPr>
-            </w:pPr>
-          </w:p>
-          <w:p>
-            <w:pPr>
-              <w:rPr>
-                <w:sz w:val="24"/>
-              </w:rPr>
-            </w:pPr>
-          </w:p>
-          <w:p>
-            <w:pPr>
-              <w:rPr>
-                <w:sz w:val="24"/>
-              </w:rPr>
-            </w:pPr>
-          </w:p>
-          <w:p>
-            <w:r>
-              <w:rPr>
-                <w:color w:val="323232"/>
-                <w:sz w:val="24"/>
-                <w:szCs w:val="24"/>
-              </w:rPr>
-              <w:t>Dear Rafael Guzman,</w:t>
-            </w:r>
-            <w:r>
-              <w:rPr>
-                <w:sz w:val="24"/>
-              </w:rPr>
-              <w:br/>
-            </w:r>
-            <w:r>
-              <w:rPr>
-                <w:b/>
-                <w:color w:val="612D4B"/>
-                <w:sz w:val="28"/>
-              </w:rPr>
-              <w:br/>
-            </w:r>
-            <w:r>
-              <w:rPr>
-                <w:color w:val="323232"/>
-                <w:sz w:val="24"/>
-                <w:szCs w:val="24"/>
-              </w:rPr>
-              <w:t>Thank you for the opportunity, to provide our services for your events. We look forward to sharing our services with you and your guests. Booking staff, planning and directing an event can be stressful. Therefore, we promise to do</w:t>
-            </w:r>
-            <w:r>
-              <w:rPr>
-                <w:color w:val="323232"/>
-                <w:sz w:val="24"/>
-                <w:szCs w:val="24"/>
-              </w:rPr>
-              <w:t xml:space="preserve"> </w:t>
-            </w:r>
-            <w:r>
-              <w:rPr>
-                <w:color w:val="323232"/>
-                <w:sz w:val="24"/>
-                <w:szCs w:val="24"/>
-              </w:rPr>
-              <w:t>everything we can to ease the burden on you.</w:t>
-            </w:r>
-          </w:p>
-          <w:p>
-            <w:pPr>
-              <w:pStyle w:val="Default"/>
-              <w:rPr>
-                <w:rFonts w:asciiTheme="minorHAnsi" w:eastAsiaTheme="minorEastAsia" w:hAnsiTheme="minorHAnsi"/>
-                <w:color w:val="323232"/>
-                <w:szCs w:val="24"/>
-              </w:rPr>
-            </w:pPr>
-            <w:r>
-              <w:rPr>
-                <w:rFonts w:asciiTheme="minorHAnsi" w:eastAsiaTheme="minorEastAsia" w:hAnsiTheme="minorHAnsi"/>
-                <w:color w:val="323232"/>
-                <w:szCs w:val="24"/>
-              </w:rPr>
-              <w:t xml:space="preserve">We have taken all of your concerns and requests into consideration as we developed this proposal and quote. We would like to assure you that our wait </w:t>
-            </w:r>
-            <w:proofErr w:type="spellStart"/>
-            <w:proofErr w:type="gramStart"/>
-            <w:r>
-              <w:rPr>
-                <w:rFonts w:asciiTheme="minorHAnsi" w:eastAsiaTheme="minorEastAsia" w:hAnsiTheme="minorHAnsi"/>
-                <w:color w:val="323232"/>
-                <w:szCs w:val="24"/>
-              </w:rPr>
-              <w:t>staff,catering</w:t>
-            </w:r>
-            <w:proofErr w:type="spellEnd"/>
-            <w:proofErr w:type="gramEnd"/>
-            <w:r>
-              <w:rPr>
-                <w:rFonts w:asciiTheme="minorHAnsi" w:eastAsiaTheme="minorEastAsia" w:hAnsiTheme="minorHAnsi"/>
-                <w:color w:val="323232"/>
-                <w:szCs w:val="24"/>
-              </w:rPr>
-              <w:t xml:space="preserve"> and event services will meet your high food standards and suit your personal tastes.</w:t>
-            </w:r>
-          </w:p>
-          <w:p>
-            <w:pPr>
-              <w:pStyle w:val="Default"/>
-              <w:rPr>
-                <w:rFonts w:asciiTheme="minorHAnsi" w:eastAsiaTheme="minorEastAsia" w:hAnsiTheme="minorHAnsi"/>
-                <w:color w:val="323232"/>
-                <w:szCs w:val="24"/>
-              </w:rPr>
-            </w:pPr>
-            <w:r>
-              <w:rPr>
-                <w:rFonts w:asciiTheme="minorHAnsi" w:eastAsiaTheme="minorEastAsia" w:hAnsiTheme="minorHAnsi"/>
-                <w:color w:val="323232"/>
-                <w:szCs w:val="24"/>
-              </w:rPr>
-              <w:t xml:space="preserve">In this proposal, we have only included the services that you have </w:t>
-            </w:r>
-            <w:proofErr w:type="spellStart"/>
-            <w:proofErr w:type="gramStart"/>
-            <w:r>
-              <w:rPr>
-                <w:rFonts w:asciiTheme="minorHAnsi" w:eastAsiaTheme="minorEastAsia" w:hAnsiTheme="minorHAnsi"/>
-                <w:color w:val="323232"/>
-                <w:szCs w:val="24"/>
-              </w:rPr>
-              <w:t>selected.Please</w:t>
-            </w:r>
-            <w:proofErr w:type="spellEnd"/>
-            <w:proofErr w:type="gramEnd"/>
-            <w:r>
-              <w:rPr>
-                <w:rFonts w:asciiTheme="minorHAnsi" w:eastAsiaTheme="minorEastAsia" w:hAnsiTheme="minorHAnsi"/>
-                <w:color w:val="323232"/>
-                <w:szCs w:val="24"/>
-              </w:rPr>
-              <w:t xml:space="preserve"> feel free to notify us if you have any concerns or additional services </w:t>
-            </w:r>
-            <w:proofErr w:type="spellStart"/>
-            <w:r>
-              <w:rPr>
-                <w:rFonts w:asciiTheme="minorHAnsi" w:eastAsiaTheme="minorEastAsia" w:hAnsiTheme="minorHAnsi"/>
-                <w:color w:val="323232"/>
-                <w:szCs w:val="24"/>
-              </w:rPr>
-              <w:t>thatyou</w:t>
-            </w:r>
-            <w:proofErr w:type="spellEnd"/>
-            <w:r>
-              <w:rPr>
-                <w:rFonts w:asciiTheme="minorHAnsi" w:eastAsiaTheme="minorEastAsia" w:hAnsiTheme="minorHAnsi"/>
-                <w:color w:val="323232"/>
-                <w:szCs w:val="24"/>
-              </w:rPr>
-              <w:t xml:space="preserve"> would like to request. We hope that you will find this proposal to your </w:t>
-            </w:r>
-            <w:proofErr w:type="spellStart"/>
-            <w:proofErr w:type="gramStart"/>
-            <w:r>
-              <w:rPr>
-                <w:rFonts w:asciiTheme="minorHAnsi" w:eastAsiaTheme="minorEastAsia" w:hAnsiTheme="minorHAnsi"/>
-                <w:color w:val="323232"/>
-                <w:szCs w:val="24"/>
-              </w:rPr>
-              <w:t>liking.We</w:t>
-            </w:r>
-            <w:proofErr w:type="spellEnd"/>
-            <w:proofErr w:type="gramEnd"/>
-            <w:r>
-              <w:rPr>
-                <w:rFonts w:asciiTheme="minorHAnsi" w:eastAsiaTheme="minorEastAsia" w:hAnsiTheme="minorHAnsi"/>
-                <w:color w:val="323232"/>
-                <w:szCs w:val="24"/>
-              </w:rPr>
-              <w:t xml:space="preserve"> are looking forward to helping provide all your guests with an enjoyable and unforgettable experience.</w:t>
-            </w:r>
-          </w:p>
-          <w:p>
-            <w:pPr>
-              <w:pStyle w:val="Default"/>
-              <w:rPr>
-                <w:rFonts w:asciiTheme="minorHAnsi" w:eastAsiaTheme="minorEastAsia" w:hAnsiTheme="minorHAnsi"/>
-                <w:color w:val="323232"/>
-                <w:szCs w:val="24"/>
-              </w:rPr>
-            </w:pPr>
-            <w:r>
-              <w:rPr>
-                <w:rFonts w:asciiTheme="minorHAnsi" w:eastAsiaTheme="minorEastAsia" w:hAnsiTheme="minorHAnsi"/>
-                <w:color w:val="323232"/>
-                <w:szCs w:val="24"/>
-              </w:rPr>
-              <w:t>Sincerely</w:t>
-            </w:r>
-            <w:r>
-              <w:rPr>
-                <w:rFonts w:asciiTheme="minorHAnsi" w:eastAsiaTheme="minorEastAsia" w:hAnsiTheme="minorHAnsi"/>
-                <w:color w:val="323232"/>
-                <w:szCs w:val="24"/>
-              </w:rPr>
-              <w:t>.</w:t>
-            </w:r>
-          </w:p>
-          <w:p>
-            <w:pPr>
-              <w:pStyle w:val="Default"/>
-              <w:rPr>
-                <w:rFonts w:asciiTheme="minorHAnsi" w:eastAsiaTheme="minorEastAsia" w:hAnsiTheme="minorHAnsi"/>
-                <w:color w:val="323232"/>
-                <w:szCs w:val="24"/>
-              </w:rPr>
-            </w:pPr>
-            <w:r>
-              <w:rPr>
-                <w:rFonts w:asciiTheme="minorHAnsi" w:eastAsiaTheme="minorEastAsia" w:hAnsiTheme="minorHAnsi"/>
-                <w:color w:val="323232"/>
-                <w:szCs w:val="24"/>
-              </w:rPr>
-              <w:t>_______________________</w:t>
-            </w:r>
-            <w:r>
-              <w:rPr>
-                <w:rFonts w:asciiTheme="minorHAnsi" w:eastAsiaTheme="minorEastAsia" w:hAnsiTheme="minorHAnsi"/>
-                <w:color w:val="323232"/>
-                <w:szCs w:val="24"/>
-              </w:rPr>
-              <w:t>_____________</w:t>
-            </w:r>
-          </w:p>
-          <w:p>
-            <w:pPr>
-              <w:pStyle w:val="Default"/>
-              <w:rPr>
-                <w:rFonts w:asciiTheme="minorHAnsi" w:eastAsiaTheme="minorEastAsia" w:hAnsiTheme="minorHAnsi"/>
-                <w:color w:val="323232"/>
-                <w:szCs w:val="24"/>
-              </w:rPr>
-            </w:pPr>
-            <w:r>
-              <w:rPr>
-                <w:rFonts w:asciiTheme="minorHAnsi" w:eastAsiaTheme="minorEastAsia" w:hAnsiTheme="minorHAnsi"/>
-                <w:color w:val="323232"/>
-                <w:szCs w:val="24"/>
-              </w:rPr>
-              <w:t>Jane Doe</w:t>
-            </w:r>
-          </w:p>
-          <w:p/>
-        </w:tc>
-      </w:tr>
-    </w:tbl>
-    <w:tbl>
-      <w:tblPr>
-        <w:tblW w:type="auto" w:w="0"/>
-        <w:tblLayout w:type="fixed"/>
-        <w:tblLook w:firstColumn="1" w:firstRow="1" w:lastColumn="0" w:lastRow="0" w:noHBand="0" w:noVBand="1" w:val="04A0"/>
-      </w:tblPr>
-      <w:tblGrid>
-        <w:gridCol w:w="3118"/>
-        <w:gridCol w:w="7087"/>
-      </w:tblGrid>
-      <w:tr>
-        <w:tc>
-          <w:tcPr>
-            <w:tcW w:type="dxa" w:w="3118"/>
-          </w:tcPr>
-          <w:p/>
-          <w:p>
-            <w:pPr>
-              <w:jc w:val="center"/>
-            </w:pPr>
-            <w:r>
-              <w:drawing>
-                <wp:inline xmlns:a="http://schemas.openxmlformats.org/drawingml/2006/main" xmlns:pic="http://schemas.openxmlformats.org/drawingml/2006/picture">
-                  <wp:extent cx="1800000" cy="777273"/>
-                  <wp:docPr id="2084747446" name="Picture 2084747446"/>
-                  <wp:cNvGraphicFramePr>
-                    <a:graphicFrameLocks noChangeAspect="1"/>
-                  </wp:cNvGraphicFramePr>
-                  <a:graphic>
-                    <a:graphicData uri="http://schemas.openxmlformats.org/drawingml/2006/picture">
-                      <pic:pic>
-                        <pic:nvPicPr>
-                          <pic:cNvPr id="0" name="image.jpg"/>
-                          <pic:cNvPicPr/>
-                        </pic:nvPicPr>
-                        <pic:blipFill>
-                          <a:blip r:embed="rId7"/>
-                          <a:stretch>
-                            <a:fillRect/>
-                          </a:stretch>
-                        </pic:blipFill>
-                        <pic:spPr>
-                          <a:xfrm>
-                            <a:off x="0" y="0"/>
-                            <a:ext cx="1800000" cy="777273"/>
-                          </a:xfrm>
-                          <a:prstGeom prst="rect"/>
-                        </pic:spPr>
-                      </pic:pic>
-                    </a:graphicData>
-                  </a:graphic>
-                </wp:inline>
-              </w:drawing>
-            </w:r>
-          </w:p>
-          <w:p/>
-          <w:p>
-            <w:r>
-              <w:rPr>
-                <w:b/>
-                <w:i/>
-                <w:color w:val="612D4B"/>
-                <w:sz w:val="26"/>
-              </w:rPr>
-              <w:t>We create everlasting moments</w:t>
-            </w:r>
-          </w:p>
-          <w:p/>
-          <w:p>
-            <w:r>
-              <w:rPr>
-                <w:b/>
-                <w:color w:val="612D4B"/>
-                <w:sz w:val="24"/>
-              </w:rPr>
-              <w:t>Client</w:t>
-            </w:r>
-          </w:p>
-          <w:p>
-            <w:pPr>
-              <w:spacing w:after="40"/>
-            </w:pPr>
-            <w:r>
-              <w:rPr>
-                <w:sz w:val="20"/>
-              </w:rPr>
-              <w:t>Rafael Guzman</w:t>
-            </w:r>
-          </w:p>
-          <w:p>
-            <w:pPr>
-              <w:spacing w:after="40"/>
-            </w:pPr>
-            <w:r>
-              <w:rPr>
-                <w:sz w:val="20"/>
-              </w:rPr>
-              <w:t>Santo Domingo, DR</w:t>
-            </w:r>
-          </w:p>
-          <w:p>
-            <w:pPr>
-              <w:spacing w:after="40"/>
-            </w:pPr>
-            <w:r>
-              <w:rPr>
-                <w:sz w:val="20"/>
-              </w:rPr>
-              <w:t>rafael@example.com</w:t>
-            </w:r>
-          </w:p>
-          <w:p/>
-          <w:p>
-            <w:r>
-              <w:rPr>
-                <w:b/>
-                <w:color w:val="612D4B"/>
-                <w:sz w:val="24"/>
-              </w:rPr>
-              <w:t>Client Representative</w:t>
-            </w:r>
-          </w:p>
-          <w:p>
-            <w:pPr>
-              <w:spacing w:after="40"/>
-            </w:pPr>
-            <w:r>
-              <w:rPr>
-                <w:sz w:val="20"/>
-              </w:rPr>
-              <w:t>Jane Doe</w:t>
-            </w:r>
-          </w:p>
-          <w:p>
-            <w:pPr>
-              <w:spacing w:after="40"/>
-            </w:pPr>
-            <w:r>
-              <w:rPr>
-                <w:sz w:val="20"/>
-              </w:rPr>
-              <w:t>jane@business.com</w:t>
-            </w:r>
-          </w:p>
-          <w:p>
-            <w:pPr>
-              <w:spacing w:after="40"/>
-            </w:pPr>
-            <w:r>
-              <w:rPr>
-                <w:sz w:val="20"/>
-              </w:rPr>
-              <w:t>Ph: +1 555-0198</w:t>
-            </w:r>
-          </w:p>
-          <w:p/>
-          <w:p>
-            <w:r>
-              <w:rPr>
-                <w:b/>
-                <w:color w:val="612D4B"/>
-                <w:sz w:val="24"/>
-              </w:rPr>
-              <w:t>Event Details</w:t>
-            </w:r>
-          </w:p>
-          <w:p>
-            <w:pPr>
-              <w:spacing w:after="40"/>
-            </w:pPr>
-            <w:r>
-              <w:rPr>
-                <w:sz w:val="20"/>
-              </w:rPr>
-              <w:t>Annual Corporate Summit 2025</w:t>
-            </w:r>
-          </w:p>
-          <w:p>
-            <w:pPr>
-              <w:spacing w:after="40"/>
-            </w:pPr>
-            <w:r>
-              <w:rPr>
-                <w:sz w:val="20"/>
-              </w:rPr>
-              <w:t>789 Event Center Blvd, NY</w:t>
-            </w:r>
-          </w:p>
-          <w:p>
-            <w:pPr>
-              <w:spacing w:after="40"/>
-            </w:pPr>
-            <w:r>
-              <w:rPr>
-                <w:sz w:val="20"/>
-              </w:rPr>
-              <w:t>Event Code: EV-2025-099</w:t>
-            </w:r>
-          </w:p>
-          <w:p>
-            <w:pPr>
-              <w:spacing w:after="40"/>
-            </w:pPr>
-            <w:r>
-              <w:rPr>
-                <w:sz w:val="20"/>
-              </w:rPr>
-              <w:t>Start: Saturday, October 14th 2025</w:t>
-            </w:r>
-          </w:p>
-          <w:p>
-            <w:pPr>
-              <w:spacing w:after="40"/>
-            </w:pPr>
-            <w:r>
-              <w:rPr>
-                <w:sz w:val="20"/>
-              </w:rPr>
-              <w:t>End: Sunday, October 15th 2025</w:t>
-            </w:r>
-          </w:p>
-          <w:p>
-            <w:pPr>
-              <w:spacing w:after="40"/>
-            </w:pPr>
-            <w:r>
-              <w:rPr>
-                <w:sz w:val="20"/>
-              </w:rPr>
-              <w:t>200 Guests</w:t>
-            </w:r>
-          </w:p>
-          <w:p/>
-          <w:p>
-            <w:pPr>
-              <w:jc w:val="center"/>
-            </w:pPr>
-            <w:r>
-              <w:drawing>
-                <wp:inline xmlns:a="http://schemas.openxmlformats.org/drawingml/2006/main" xmlns:pic="http://schemas.openxmlformats.org/drawingml/2006/picture">
-                  <wp:extent cx="1260000" cy="1036636"/>
-                  <wp:docPr id="2084747447" name="Picture 2084747447"/>
-                  <wp:cNvGraphicFramePr>
-                    <a:graphicFrameLocks noChangeAspect="1"/>
-                  </wp:cNvGraphicFramePr>
-                  <a:graphic>
-                    <a:graphicData uri="http://schemas.openxmlformats.org/drawingml/2006/picture">
-                      <pic:pic>
-                        <pic:nvPicPr>
-                          <pic:cNvPr id="0" name="image.jpg"/>
-                          <pic:cNvPicPr/>
-                        </pic:nvPicPr>
-                        <pic:blipFill>
-                          <a:blip r:embed="rId6"/>
-                          <a:stretch>
-                            <a:fillRect/>
-                          </a:stretch>
-                        </pic:blipFill>
-                        <pic:spPr>
-                          <a:xfrm>
-                            <a:off x="0" y="0"/>
-                            <a:ext cx="1260000" cy="1036636"/>
-                          </a:xfrm>
-                          <a:prstGeom prst="rect"/>
-                        </pic:spPr>
-                      </pic:pic>
-                    </a:graphicData>
-                  </a:graphic>
-                </wp:inline>
-              </w:drawing>
-            </w:r>
-          </w:p>
-        </w:tc>
-        <w:tc>
-          <w:tcPr>
-            <w:tcW w:type="dxa" w:w="7087"/>
-          </w:tcPr>
-          <w:p/>
-          <w:p>
-            <w:r>
-              <w:rPr>
-                <w:b/>
-                <w:color w:val="612D4B"/>
-                <w:sz w:val="28"/>
-              </w:rPr>
-              <w:t>PROPOSAL OF SERVICES</w:t>
-            </w:r>
-          </w:p>
-          <w:p>
-            <w:r>
-              <w:t>Sunday, October 15th 2025</w:t>
-            </w:r>
-          </w:p>
-          <w:p/>
-          <w:p>
-            <w:r>
-              <w:rPr>
-                <w:b/>
-              </w:rPr>
-              <w:t>Saturday, October 14th</w:t>
-            </w:r>
-          </w:p>
-          <w:p/>
-          <w:p>
-            <w:r>
-              <w:rPr>
-                <w:b/>
-                <w:color w:val="612D4B"/>
-              </w:rPr>
-              <w:t>Breakfast (8:00 AM to 10:00 AM)</w:t>
-            </w:r>
-          </w:p>
-          <w:p>
-            <w:r>
-              <w:t>Premium Continental Breakfast</w:t>
-            </w:r>
-          </w:p>
-          <w:p>
-            <w:r>
-              <w:rPr>
-                <w:b/>
-                <w:color w:val="000000"/>
-                <w:u w:val="single"/>
-              </w:rPr>
-              <w:t>Appetizers</w:t>
-            </w:r>
-          </w:p>
-          <w:p>
-            <w:r>
-              <w:t>Starters for the table</w:t>
-            </w:r>
-          </w:p>
-          <w:p>
-            <w:pPr>
-              <w:ind w:left="283"/>
-            </w:pPr>
-            <w:r>
-              <w:rPr>
-                <w:b/>
-                <w:color w:val="612D4B"/>
-              </w:rPr>
-              <w:t>• Bruschetta</w:t>
-            </w:r>
-            <w:r>
-              <w:rPr>
-                <w:color w:val="612D4B"/>
-              </w:rPr>
-              <w:t xml:space="preserve"> (VG)</w:t>
-            </w:r>
-          </w:p>
-          <w:p>
-            <w:pPr>
-              <w:ind w:left="567"/>
-            </w:pPr>
-            <w:r>
-              <w:rPr>
-                <w:i/>
-                <w:color w:val="555555"/>
-                <w:sz w:val="20"/>
-              </w:rPr>
-              <w:t>Chopped tomatoes, basil, and garlic on toasted focaccia</w:t>
-            </w:r>
-          </w:p>
-          <w:p>
-            <w:pPr>
-              <w:ind w:left="283"/>
-            </w:pPr>
-            <w:r>
-              <w:rPr>
-                <w:b/>
-                <w:color w:val="612D4B"/>
-              </w:rPr>
-              <w:t>• Mini Meatballs</w:t>
-            </w:r>
-          </w:p>
-          <w:p>
-            <w:pPr>
-              <w:ind w:left="567"/>
-            </w:pPr>
-            <w:r>
-              <w:rPr>
-                <w:i/>
-                <w:color w:val="555555"/>
-                <w:sz w:val="20"/>
-              </w:rPr>
-              <w:t>With marinara dipping sauce</w:t>
-            </w:r>
-          </w:p>
-          <w:p>
-            <w:r>
-              <w:rPr>
-                <w:b/>
-                <w:color w:val="000000"/>
-                <w:u w:val="single"/>
-              </w:rPr>
-              <w:t>Main Course</w:t>
-            </w:r>
-          </w:p>
-          <w:p>
-            <w:r>
-              <w:t>The big event</w:t>
-            </w:r>
-          </w:p>
-          <w:p>
-            <w:pPr>
-              <w:ind w:left="283"/>
-            </w:pPr>
-            <w:r>
-              <w:rPr>
-                <w:b/>
-                <w:color w:val="612D4B"/>
-              </w:rPr>
-              <w:t>• Grilled Lemon Herb Chicken</w:t>
-            </w:r>
-            <w:r>
-              <w:rPr>
-                <w:color w:val="612D4B"/>
-              </w:rPr>
-              <w:t xml:space="preserve"> (GF)</w:t>
-            </w:r>
-          </w:p>
-          <w:p/>
-          <w:p>
-            <w:r>
-              <w:rPr>
-                <w:b/>
-                <w:color w:val="612D4B"/>
-              </w:rPr>
-              <w:t>Estimation</w:t>
-            </w:r>
-          </w:p>
-          <w:p>
-            <w:r>
-              <w:rPr>
-                <w:b/>
-              </w:rPr>
-              <w:t xml:space="preserve">Food: </w:t>
-            </w:r>
-            <w:r>
-              <w:t>$5,000.00</w:t>
-            </w:r>
-          </w:p>
-          <w:p>
-            <w:r>
-              <w:rPr>
-                <w:b/>
-              </w:rPr>
-              <w:t xml:space="preserve">Labor Cost: </w:t>
-            </w:r>
-            <w:r>
-              <w:t>$1,400.00</w:t>
-            </w:r>
-          </w:p>
-          <w:p>
-            <w:r>
-              <w:rPr>
-                <w:b/>
-              </w:rPr>
-              <w:t xml:space="preserve">Extras Services: </w:t>
-            </w:r>
-            <w:r>
-              <w:t>$1,250.00</w:t>
-            </w:r>
-          </w:p>
-          <w:p>
-            <w:r>
-              <w:rPr>
-                <w:b/>
-              </w:rPr>
-              <w:t xml:space="preserve">8.875% NY State Tax: </w:t>
-            </w:r>
-            <w:r>
-              <w:t>$678.94</w:t>
-            </w:r>
-          </w:p>
-          <w:p>
-            <w:r>
-              <w:rPr>
-                <w:b/>
-              </w:rPr>
-              <w:t xml:space="preserve">18% Service Charge: </w:t>
-            </w:r>
-            <w:r>
-              <w:t>$1,377.00</w:t>
-            </w:r>
-          </w:p>
-          <w:p>
-            <w:r>
-              <w:rPr>
-                <w:b/>
-                <w:sz w:val="26"/>
-              </w:rPr>
-              <w:t>Total Estimate: $10,005.94</w:t>
-            </w:r>
-          </w:p>
-        </w:tc>
-      </w:tr>
-    </w:tbl>
-    <w:p/>
-    <w:p/>
-    <w:p/>
-    <w:p/>
-    <w:p/>
-    <w:p/>
-    <w:p/>
-    <w:p/>
-    <w:p/>
-    <w:p/>
-    <w:p/>
-    <w:p/>
-    <w:p/>
-    <w:p/>
-    <w:p/>
-    <w:p/>
-    <w:p/>
-    <w:p/>
-    <w:p/>
-    <w:p/>
-    <w:p/>
-    <w:p/>
-    <w:p/>
-    <w:p/>
-    <w:tbl>
-      <w:tblPr>
-        <w:tblW w:w="9803" w:type="dxa"/>
-        <w:tblInd w:w="-578" w:type="dxa"/>
-        <w:tblLayout w:type="fixed"/>
-        <w:tblLook w:val="04A0" w:firstRow="1" w:lastRow="0" w:firstColumn="1" w:lastColumn="0" w:noHBand="0" w:noVBand="1"/>
-      </w:tblPr>
-      <w:tblGrid>
-        <w:gridCol w:w="3672"/>
-        <w:gridCol w:w="6131"/>
-      </w:tblGrid>
-      <w:tr>
-        <w:trPr>
-          <w:trHeight w:val="14061"/>
-        </w:trPr>
-        <w:tc>
-          <w:tcPr>
-            <w:tcW w:w="3672" w:type="dxa"/>
-          </w:tcPr>
-          <w:p>
-            <w:r>
-              <w:rPr>
-                <w:noProof/>
-              </w:rPr>
-              <w:lastRenderedPageBreak/>
-              <w:drawing>
-                <wp:anchor distT="0" distB="0" distL="0" distR="0" simplePos="0" relativeHeight="251666432" behindDoc="0" locked="0" layoutInCell="0" allowOverlap="1" wp14:anchorId="3F341AD9" wp14:editId="4CF6BD57">
-                  <wp:simplePos x="0" y="0"/>
-                  <wp:positionH relativeFrom="column">
-                    <wp:posOffset>-37465</wp:posOffset>
-                  </wp:positionH>
-                  <wp:positionV relativeFrom="paragraph">
-                    <wp:posOffset>-447040</wp:posOffset>
-                  </wp:positionV>
-                  <wp:extent cx="2397760" cy="1035685"/>
-                  <wp:effectExtent l="0" t="0" r="0" b="0"/>
-                  <wp:wrapTopAndBottom/>
-                  <wp:docPr id="2084747445" name="Image2"/>
-                  <wp:cNvGraphicFramePr>
-                    <a:graphicFrameLocks xmlns:a="http://schemas.openxmlformats.org/drawingml/2006/main" noChangeAspect="1"/>
-                  </wp:cNvGraphicFramePr>
-                  <a:graphic xmlns:a="http://schemas.openxmlformats.org/drawingml/2006/main">
-                    <a:graphicData uri="http://schemas.openxmlformats.org/drawingml/2006/picture">
-                      <pic:pic xmlns:pic="http://schemas.openxmlformats.org/drawingml/2006/picture">
-                        <pic:nvPicPr>
-                          <pic:cNvPr id="2" name="Image2"/>
-                          <pic:cNvPicPr>
-                            <a:picLocks noChangeAspect="1" noChangeArrowheads="1"/>
-                          </pic:cNvPicPr>
-                        </pic:nvPicPr>
-                        <pic:blipFill>
-                          <a:blip r:embed="rId7"/>
-                          <a:stretch>
-                            <a:fillRect/>
-                          </a:stretch>
-                        </pic:blipFill>
-                        <pic:spPr bwMode="auto">
-                          <a:xfrm>
-                            <a:off x="0" y="0"/>
-                            <a:ext cx="2397760" cy="1035685"/>
-                          </a:xfrm>
-                          <a:prstGeom prst="rect">
-                            <a:avLst/>
-                          </a:prstGeom>
-                          <a:noFill/>
-                        </pic:spPr>
-                      </pic:pic>
-                    </a:graphicData>
-                  </a:graphic>
-                </wp:anchor>
-              </w:drawing>
-            </w:r>
-            <w:r>
-              <w:rPr>
-                <w:b/>
-                <w:i/>
-                <w:color w:val="612D4B"/>
-                <w:sz w:val="26"/>
-              </w:rPr>
-              <w:t>We create everlasting moments</w:t>
-            </w:r>
-          </w:p>
-          <w:p/>
-          <w:p>
-            <w:r>
-              <w:rPr>
-                <w:b/>
-                <w:color w:val="612D4B"/>
-                <w:sz w:val="24"/>
-              </w:rPr>
-              <w:t>Client</w:t>
-            </w:r>
-          </w:p>
-          <w:p>
-            <w:pPr>
-              <w:spacing w:after="40"/>
-              <w:rPr>
-                <w:rFonts w:ascii="Cambria" w:hAnsi="Cambria"/>
-                <w:color w:val="000000"/>
-                <w:sz w:val="18"/>
-              </w:rPr>
-            </w:pPr>
-            <w:r>
-              <w:rPr>
-                <w:rFonts w:ascii="Cambria" w:hAnsi="Cambria"/>
-                <w:color w:val="000000"/>
-                <w:sz w:val="18"/>
-              </w:rPr>
-              <w:t>Rafael Guzman</w:t>
-            </w:r>
-          </w:p>
-          <w:p>
-            <w:pPr>
-              <w:spacing w:after="40"/>
-            </w:pPr>
-            <w:r>
-              <w:rPr>
-                <w:sz w:val="20"/>
-              </w:rPr>
-              <w:t>Santo Domingo, DR</w:t>
-            </w:r>
-          </w:p>
-          <w:p>
-            <w:pPr>
-              <w:spacing w:after="40"/>
-            </w:pPr>
-            <w:r>
-              <w:rPr>
-                <w:sz w:val="20"/>
-              </w:rPr>
-              <w:t>rafael@example.com</w:t>
-            </w:r>
-          </w:p>
-          <w:p/>
-          <w:p>
-            <w:r>
-              <w:rPr>
-                <w:b/>
-                <w:color w:val="612D4B"/>
-                <w:sz w:val="24"/>
-              </w:rPr>
-              <w:t>Client Representative</w:t>
-            </w:r>
-          </w:p>
-          <w:p>
-            <w:pPr>
-              <w:spacing w:after="40"/>
-            </w:pPr>
-            <w:r>
-              <w:rPr>
-                <w:sz w:val="20"/>
-              </w:rPr>
-              <w:t>Jane Doe</w:t>
-            </w:r>
-          </w:p>
-          <w:p>
-            <w:pPr>
-              <w:spacing w:after="40"/>
-            </w:pPr>
-            <w:r>
-              <w:rPr>
-                <w:sz w:val="20"/>
-              </w:rPr>
-              <w:t>jane@business.com</w:t>
-            </w:r>
-          </w:p>
-          <w:p>
-            <w:pPr>
-              <w:spacing w:after="40"/>
-            </w:pPr>
-            <w:r>
-              <w:rPr>
-                <w:sz w:val="20"/>
-              </w:rPr>
-              <w:t>Ph: +1 555-0198</w:t>
-            </w:r>
-          </w:p>
-          <w:p/>
-          <w:p>
-            <w:r>
-              <w:rPr>
-                <w:b/>
-                <w:color w:val="612D4B"/>
-                <w:sz w:val="24"/>
-              </w:rPr>
-              <w:t>Event Details</w:t>
-            </w:r>
-          </w:p>
-          <w:p>
-            <w:pPr>
-              <w:spacing w:after="40"/>
-            </w:pPr>
-            <w:r>
-              <w:rPr>
-                <w:sz w:val="20"/>
-              </w:rPr>
-              <w:t>789 Event Center Blvd, NY</w:t>
-            </w:r>
-          </w:p>
-          <w:p>
-            <w:pPr>
-              <w:spacing w:after="40"/>
-            </w:pPr>
-            <w:r>
-              <w:rPr>
-                <w:sz w:val="20"/>
-              </w:rPr>
-              <w:t>Event Code: EV-2025-099</w:t>
-            </w:r>
-          </w:p>
-          <w:p>
-            <w:pPr>
-              <w:spacing w:after="40"/>
-            </w:pPr>
-            <w:r>
-              <w:rPr>
-                <w:sz w:val="20"/>
-              </w:rPr>
-              <w:t>Start: Saturday, October 14th 2025</w:t>
-            </w:r>
-          </w:p>
-          <w:p>
-            <w:pPr>
-              <w:spacing w:after="40"/>
-            </w:pPr>
-            <w:r>
-              <w:rPr>
-                <w:sz w:val="20"/>
-              </w:rPr>
-              <w:t>End: Sunday, October 15th 2025</w:t>
-            </w:r>
-          </w:p>
-          <w:p>
-            <w:pPr>
-              <w:spacing w:after="40"/>
-            </w:pPr>
-            <w:r>
-              <w:rPr>
-                <w:noProof/>
-              </w:rPr>
-              <w:drawing>
-                <wp:anchor distT="0" distB="0" distL="0" distR="0" simplePos="0" relativeHeight="251667456" behindDoc="1" locked="0" layoutInCell="0" allowOverlap="1" wp14:anchorId="30CA8986" wp14:editId="650AA821">
-                  <wp:simplePos x="0" y="0"/>
-                  <wp:positionH relativeFrom="column">
-                    <wp:posOffset>150495</wp:posOffset>
-                  </wp:positionH>
-                  <wp:positionV relativeFrom="paragraph">
-                    <wp:posOffset>452755</wp:posOffset>
-                  </wp:positionV>
-                  <wp:extent cx="1169035" cy="962025"/>
-                  <wp:effectExtent l="0" t="0" r="0" b="9525"/>
-                  <wp:wrapTopAndBottom/>
-                  <wp:docPr id="666251544" name="Image1"/>
-                  <wp:cNvGraphicFramePr>
-                    <a:graphicFrameLocks xmlns:a="http://schemas.openxmlformats.org/drawingml/2006/main" noChangeAspect="1"/>
-                  </wp:cNvGraphicFramePr>
-                  <a:graphic xmlns:a="http://schemas.openxmlformats.org/drawingml/2006/main">
-                    <a:graphicData uri="http://schemas.openxmlformats.org/drawingml/2006/picture">
-                      <pic:pic xmlns:pic="http://schemas.openxmlformats.org/drawingml/2006/picture">
-                        <pic:nvPicPr>
-                          <pic:cNvPr id="1" name="Image1"/>
-                          <pic:cNvPicPr>
-                            <a:picLocks noChangeAspect="1" noChangeArrowheads="1"/>
-                          </pic:cNvPicPr>
-                        </pic:nvPicPr>
-                        <pic:blipFill>
-                          <a:blip r:embed="rId6"/>
-                          <a:stretch>
-                            <a:fillRect/>
-                          </a:stretch>
-                        </pic:blipFill>
-                        <pic:spPr bwMode="auto">
-                          <a:xfrm>
-                            <a:off x="0" y="0"/>
-                            <a:ext cx="1169035" cy="962025"/>
-                          </a:xfrm>
-                          <a:prstGeom prst="rect">
-                            <a:avLst/>
-                          </a:prstGeom>
-                          <a:noFill/>
-                        </pic:spPr>
-                      </pic:pic>
-                    </a:graphicData>
-                  </a:graphic>
-                  <wp14:sizeRelH relativeFrom="margin">
-                    <wp14:pctWidth>0</wp14:pctWidth>
-                  </wp14:sizeRelH>
-                  <wp14:sizeRelV relativeFrom="margin">
-                    <wp14:pctHeight>0</wp14:pctHeight>
-                  </wp14:sizeRelV>
-                </wp:anchor>
-              </w:drawing>
-            </w:r>
-            <w:r>
-              <w:rPr>
-                <w:noProof/>
-              </w:rPr>
-              <w:drawing>
-                <wp:anchor distT="0" distB="0" distL="0" distR="0" simplePos="0" relativeHeight="251665408" behindDoc="0" locked="0" layoutInCell="0" allowOverlap="1" wp14:anchorId="64E0DAA5" wp14:editId="2130D1EC">
-                  <wp:simplePos x="0" y="0"/>
-                  <wp:positionH relativeFrom="column">
-                    <wp:posOffset>-58908</wp:posOffset>
-                  </wp:positionH>
-                  <wp:positionV relativeFrom="paragraph">
-                    <wp:posOffset>7260723</wp:posOffset>
-                  </wp:positionV>
-                  <wp:extent cx="1532890" cy="1261110"/>
-                  <wp:effectExtent l="0" t="0" r="0" b="0"/>
-                  <wp:wrapNone/>
-                  <wp:docPr id="1833367390" name="Image1 Copy 1"/>
-                  <wp:cNvGraphicFramePr>
-                    <a:graphicFrameLocks xmlns:a="http://schemas.openxmlformats.org/drawingml/2006/main" noChangeAspect="1"/>
-                  </wp:cNvGraphicFramePr>
-                  <a:graphic xmlns:a="http://schemas.openxmlformats.org/drawingml/2006/main">
-                    <a:graphicData uri="http://schemas.openxmlformats.org/drawingml/2006/picture">
-                      <pic:pic xmlns:pic="http://schemas.openxmlformats.org/drawingml/2006/picture">
-                        <pic:nvPicPr>
-                          <pic:cNvPr id="3" name="Image1 Copy 1"/>
-                          <pic:cNvPicPr>
-                            <a:picLocks noChangeAspect="1" noChangeArrowheads="1"/>
-                          </pic:cNvPicPr>
-                        </pic:nvPicPr>
-                        <pic:blipFill>
-                          <a:blip r:embed="rId6"/>
-                          <a:stretch>
-                            <a:fillRect/>
-                          </a:stretch>
-                        </pic:blipFill>
-                        <pic:spPr bwMode="auto">
-                          <a:xfrm>
-                            <a:off x="0" y="0"/>
-                            <a:ext cx="1532890" cy="1261110"/>
-                          </a:xfrm>
-                          <a:prstGeom prst="rect">
-                            <a:avLst/>
-                          </a:prstGeom>
-                          <a:noFill/>
-                        </pic:spPr>
-                      </pic:pic>
-                    </a:graphicData>
-                  </a:graphic>
-                </wp:anchor>
-              </w:drawing>
-            </w:r>
-            <w:r>
-              <w:rPr>
-                <w:sz w:val="20"/>
-              </w:rPr>
-              <w:t>200 Guests</w:t>
-            </w:r>
-          </w:p>
-        </w:tc>
-        <w:tc>
-          <w:tcPr>
-            <w:tcW w:w="6131" w:type="dxa"/>
-          </w:tcPr>
-          <w:p>
-            <w:pPr>
-              <w:rPr>
-                <w:b/>
-                <w:color w:val="612D4B"/>
-                <w:sz w:val="24"/>
-              </w:rPr>
-            </w:pPr>
-            <w:r>
-              <w:rPr>
-                <w:b/>
-                <w:color w:val="612D4B"/>
-                <w:sz w:val="24"/>
-              </w:rPr>
-              <w:t>Explanation of Fees</w:t>
-            </w:r>
-          </w:p>
-          <w:p>
-            <w:pPr>
-              <w:rPr>
-                <w:b/>
-                <w:bCs/>
-                <w:sz w:val="20"/>
-                <w:szCs w:val="20"/>
-              </w:rPr>
-            </w:pPr>
-            <w:r>
-              <w:rPr>
-                <w:b/>
-                <w:bCs/>
-                <w:sz w:val="20"/>
-                <w:szCs w:val="20"/>
-              </w:rPr>
-              <w:t>Event Planning Service</w:t>
-            </w:r>
-          </w:p>
-          <w:p>
-            <w:pPr>
-              <w:jc w:val="both"/>
-              <w:rPr>
-                <w:sz w:val="20"/>
-                <w:szCs w:val="20"/>
-              </w:rPr>
-            </w:pPr>
-            <w:r>
-              <w:rPr>
-                <w:sz w:val="20"/>
-                <w:szCs w:val="20"/>
-              </w:rPr>
-              <w:t xml:space="preserve">If a client </w:t>
-            </w:r>
-            <w:proofErr w:type="spellStart"/>
-            <w:r>
-              <w:rPr>
-                <w:sz w:val="20"/>
-                <w:szCs w:val="20"/>
-              </w:rPr>
-              <w:t>resquets</w:t>
-            </w:r>
-            <w:proofErr w:type="spellEnd"/>
-            <w:r>
-              <w:rPr>
-                <w:sz w:val="20"/>
-                <w:szCs w:val="20"/>
-              </w:rPr>
-              <w:t xml:space="preserve"> that the caterer </w:t>
-            </w:r>
-            <w:proofErr w:type="gramStart"/>
-            <w:r>
-              <w:rPr>
-                <w:sz w:val="20"/>
-                <w:szCs w:val="20"/>
-              </w:rPr>
-              <w:t>coordinate</w:t>
-            </w:r>
-            <w:proofErr w:type="gramEnd"/>
-            <w:r>
-              <w:rPr>
-                <w:sz w:val="20"/>
-                <w:szCs w:val="20"/>
-              </w:rPr>
-              <w:t xml:space="preserve"> the venue rental &amp; décor,</w:t>
-            </w:r>
-            <w:r>
-              <w:rPr>
-                <w:sz w:val="20"/>
-                <w:szCs w:val="20"/>
-              </w:rPr>
-              <w:t xml:space="preserve"> </w:t>
-            </w:r>
-            <w:r>
-              <w:rPr>
-                <w:sz w:val="20"/>
-                <w:szCs w:val="20"/>
-              </w:rPr>
-              <w:t>entertainment, photography, valet parking, flower arranging, or other aspects of</w:t>
-            </w:r>
-            <w:r>
-              <w:rPr>
-                <w:sz w:val="20"/>
-                <w:szCs w:val="20"/>
-              </w:rPr>
-              <w:t xml:space="preserve"> </w:t>
-            </w:r>
-            <w:r>
-              <w:rPr>
-                <w:sz w:val="20"/>
-                <w:szCs w:val="20"/>
-              </w:rPr>
-              <w:t>planning the event, there will be a small fee charged for this service to account for</w:t>
-            </w:r>
-            <w:r>
-              <w:rPr>
-                <w:sz w:val="20"/>
-                <w:szCs w:val="20"/>
-              </w:rPr>
-              <w:t xml:space="preserve"> </w:t>
-            </w:r>
-            <w:r>
-              <w:rPr>
-                <w:sz w:val="20"/>
-                <w:szCs w:val="20"/>
-              </w:rPr>
-              <w:t>the labor needed to plan the event as agreed upon in writing by the parties at the</w:t>
-            </w:r>
-            <w:r>
-              <w:rPr>
-                <w:sz w:val="20"/>
-                <w:szCs w:val="20"/>
-              </w:rPr>
-              <w:t xml:space="preserve"> </w:t>
-            </w:r>
-            <w:r>
-              <w:rPr>
-                <w:sz w:val="20"/>
-                <w:szCs w:val="20"/>
-              </w:rPr>
-              <w:t>time of such request.</w:t>
-            </w:r>
-          </w:p>
-          <w:p>
-            <w:pPr>
-              <w:rPr>
-                <w:b/>
-                <w:bCs/>
-                <w:sz w:val="20"/>
-                <w:szCs w:val="20"/>
-              </w:rPr>
-            </w:pPr>
-            <w:r>
-              <w:rPr>
-                <w:b/>
-                <w:bCs/>
-                <w:sz w:val="20"/>
-                <w:szCs w:val="20"/>
-              </w:rPr>
-              <w:t>Delivery Fee</w:t>
-            </w:r>
-          </w:p>
-          <w:p>
-            <w:pPr>
-              <w:rPr>
-                <w:sz w:val="20"/>
-                <w:szCs w:val="20"/>
-              </w:rPr>
-            </w:pPr>
-            <w:r>
-              <w:rPr>
-                <w:sz w:val="20"/>
-                <w:szCs w:val="20"/>
-              </w:rPr>
-              <w:t>Not Applicable</w:t>
-            </w:r>
-          </w:p>
-          <w:p>
-            <w:pPr>
-              <w:rPr>
-                <w:b/>
-                <w:bCs/>
-                <w:sz w:val="20"/>
-                <w:szCs w:val="20"/>
-              </w:rPr>
-            </w:pPr>
-            <w:r>
-              <w:rPr>
-                <w:b/>
-                <w:bCs/>
-                <w:sz w:val="20"/>
-                <w:szCs w:val="20"/>
-              </w:rPr>
-              <w:t>Service Charge</w:t>
-            </w:r>
-          </w:p>
-          <w:p>
-            <w:pPr>
-              <w:jc w:val="both"/>
-              <w:rPr>
-                <w:sz w:val="20"/>
-                <w:szCs w:val="20"/>
-              </w:rPr>
-            </w:pPr>
-            <w:r>
-              <w:rPr>
-                <w:sz w:val="20"/>
-                <w:szCs w:val="20"/>
-              </w:rPr>
-              <w:t>A service charge of 18,00 % is Indicated in your proposal of service.</w:t>
-            </w:r>
-            <w:r>
-              <w:rPr>
-                <w:sz w:val="20"/>
-                <w:szCs w:val="20"/>
-              </w:rPr>
-              <w:t xml:space="preserve"> </w:t>
-            </w:r>
-            <w:proofErr w:type="gramStart"/>
-            <w:r>
-              <w:rPr>
-                <w:sz w:val="20"/>
-                <w:szCs w:val="20"/>
-              </w:rPr>
-              <w:t>This</w:t>
-            </w:r>
-            <w:proofErr w:type="gramEnd"/>
-            <w:r>
-              <w:rPr>
-                <w:sz w:val="20"/>
-                <w:szCs w:val="20"/>
-              </w:rPr>
-              <w:t xml:space="preserve"> fee</w:t>
-            </w:r>
-            <w:r>
-              <w:rPr>
-                <w:sz w:val="20"/>
-                <w:szCs w:val="20"/>
-              </w:rPr>
-              <w:t xml:space="preserve"> </w:t>
-            </w:r>
-            <w:r>
-              <w:rPr>
-                <w:sz w:val="20"/>
-                <w:szCs w:val="20"/>
-              </w:rPr>
-              <w:t>covers all administration, insurance fees, transportation, site visits, trucking, &amp;</w:t>
-            </w:r>
-            <w:r>
-              <w:rPr>
-                <w:sz w:val="20"/>
-                <w:szCs w:val="20"/>
-              </w:rPr>
-              <w:t xml:space="preserve"> </w:t>
-            </w:r>
-            <w:r>
-              <w:rPr>
-                <w:sz w:val="20"/>
-                <w:szCs w:val="20"/>
-              </w:rPr>
-              <w:t>supplemental costs associated with the event planning.</w:t>
-            </w:r>
-          </w:p>
-          <w:p>
-            <w:pPr>
-              <w:rPr>
-                <w:b/>
-                <w:bCs/>
-                <w:sz w:val="20"/>
-                <w:szCs w:val="20"/>
-              </w:rPr>
-            </w:pPr>
-            <w:r>
-              <w:rPr>
-                <w:b/>
-                <w:bCs/>
-                <w:sz w:val="20"/>
-                <w:szCs w:val="20"/>
-              </w:rPr>
-              <w:t>Gratuities</w:t>
-            </w:r>
-          </w:p>
-          <w:p>
-            <w:pPr>
-              <w:jc w:val="both"/>
-              <w:rPr>
-                <w:sz w:val="20"/>
-                <w:szCs w:val="20"/>
-              </w:rPr>
-            </w:pPr>
-            <w:r>
-              <w:rPr>
-                <w:sz w:val="20"/>
-                <w:szCs w:val="20"/>
-              </w:rPr>
-              <w:t>Gratuities are not included in the proposal and are at the sole discretion of the</w:t>
-            </w:r>
-            <w:r>
-              <w:rPr>
-                <w:sz w:val="20"/>
-                <w:szCs w:val="20"/>
-              </w:rPr>
-              <w:t xml:space="preserve"> </w:t>
-            </w:r>
-            <w:r>
-              <w:rPr>
-                <w:sz w:val="20"/>
-                <w:szCs w:val="20"/>
-              </w:rPr>
-              <w:t>client.</w:t>
-            </w:r>
-          </w:p>
-          <w:p>
-            <w:pPr>
-              <w:rPr>
-                <w:b/>
-                <w:bCs/>
-                <w:sz w:val="20"/>
-                <w:szCs w:val="20"/>
-              </w:rPr>
-            </w:pPr>
-            <w:r>
-              <w:rPr>
-                <w:b/>
-                <w:bCs/>
-                <w:sz w:val="20"/>
-                <w:szCs w:val="20"/>
-              </w:rPr>
-              <w:t>Taxes and Insurance</w:t>
-            </w:r>
-          </w:p>
-          <w:p>
-            <w:pPr>
-              <w:rPr>
-                <w:sz w:val="20"/>
-                <w:szCs w:val="20"/>
-              </w:rPr>
-            </w:pPr>
-            <w:r>
-              <w:rPr>
-                <w:sz w:val="20"/>
-                <w:szCs w:val="20"/>
-              </w:rPr>
-              <w:t xml:space="preserve">All prices are subject to a 18,00 % service </w:t>
-            </w:r>
-            <w:r>
-              <w:rPr>
-                <w:sz w:val="20"/>
-                <w:szCs w:val="20"/>
-              </w:rPr>
-              <w:t>and</w:t>
-            </w:r>
-          </w:p>
-          <w:p>
-            <w:pPr>
-              <w:rPr>
-                <w:b/>
-                <w:bCs/>
-                <w:sz w:val="20"/>
-                <w:szCs w:val="20"/>
-              </w:rPr>
-            </w:pPr>
-            <w:r>
-              <w:rPr>
-                <w:b/>
-                <w:bCs/>
-                <w:sz w:val="20"/>
-                <w:szCs w:val="20"/>
-              </w:rPr>
-              <w:t>Governing Terms</w:t>
-            </w:r>
-          </w:p>
-          <w:p>
-            <w:pPr>
-              <w:jc w:val="both"/>
-              <w:rPr>
-                <w:sz w:val="20"/>
-                <w:szCs w:val="20"/>
-              </w:rPr>
-            </w:pPr>
-            <w:proofErr w:type="spellStart"/>
-            <w:r>
-              <w:rPr>
-                <w:sz w:val="20"/>
-                <w:szCs w:val="20"/>
-              </w:rPr>
-              <w:t>Foodesign</w:t>
-            </w:r>
-            <w:proofErr w:type="spellEnd"/>
-            <w:r>
-              <w:rPr>
-                <w:sz w:val="20"/>
-                <w:szCs w:val="20"/>
-              </w:rPr>
-              <w:t xml:space="preserve"> Conceptual Events and the Client</w:t>
-            </w:r>
-            <w:r>
-              <w:rPr>
-                <w:sz w:val="20"/>
-                <w:szCs w:val="20"/>
-              </w:rPr>
-              <w:t xml:space="preserve"> </w:t>
-            </w:r>
-            <w:r>
-              <w:rPr>
-                <w:sz w:val="20"/>
-                <w:szCs w:val="20"/>
-              </w:rPr>
-              <w:t>acknowledge and agree that this</w:t>
-            </w:r>
-            <w:r>
-              <w:rPr>
-                <w:sz w:val="20"/>
-                <w:szCs w:val="20"/>
-              </w:rPr>
-              <w:t xml:space="preserve"> </w:t>
-            </w:r>
-            <w:r>
-              <w:rPr>
-                <w:sz w:val="20"/>
-                <w:szCs w:val="20"/>
-              </w:rPr>
-              <w:t>proposal is governed by the Master Caterer Agreement executed between the</w:t>
-            </w:r>
-            <w:r>
-              <w:rPr>
-                <w:sz w:val="20"/>
-                <w:szCs w:val="20"/>
-              </w:rPr>
-              <w:t xml:space="preserve"> </w:t>
-            </w:r>
-            <w:r>
-              <w:rPr>
-                <w:sz w:val="20"/>
-                <w:szCs w:val="20"/>
-              </w:rPr>
-              <w:t>parties.</w:t>
-            </w:r>
-          </w:p>
-          <w:p>
-            <w:pPr>
-              <w:rPr>
-                <w:b/>
-                <w:bCs/>
-                <w:sz w:val="20"/>
-                <w:szCs w:val="20"/>
-              </w:rPr>
-            </w:pPr>
-            <w:r>
-              <w:rPr>
-                <w:b/>
-                <w:bCs/>
-                <w:sz w:val="20"/>
-                <w:szCs w:val="20"/>
-              </w:rPr>
-              <w:t>Acceptance By Client</w:t>
-            </w:r>
-          </w:p>
-          <w:p>
-            <w:pPr>
-              <w:jc w:val="both"/>
-              <w:rPr>
-                <w:sz w:val="20"/>
-                <w:szCs w:val="20"/>
-              </w:rPr>
-            </w:pPr>
-            <w:r>
-              <w:rPr>
-                <w:sz w:val="20"/>
-                <w:szCs w:val="20"/>
-              </w:rPr>
-              <w:t>The undersigned, as a duly authorized representative of the Client, Math for</w:t>
-            </w:r>
-            <w:r>
-              <w:rPr>
-                <w:sz w:val="20"/>
-                <w:szCs w:val="20"/>
-              </w:rPr>
-              <w:t xml:space="preserve"> </w:t>
-            </w:r>
-            <w:r>
-              <w:rPr>
-                <w:sz w:val="20"/>
-                <w:szCs w:val="20"/>
-              </w:rPr>
-              <w:t>America, hereby contract the</w:t>
-            </w:r>
-            <w:r>
-              <w:rPr>
-                <w:sz w:val="20"/>
-                <w:szCs w:val="20"/>
-              </w:rPr>
-              <w:t xml:space="preserve"> </w:t>
-            </w:r>
-            <w:r>
-              <w:rPr>
-                <w:sz w:val="20"/>
-                <w:szCs w:val="20"/>
-              </w:rPr>
-              <w:t xml:space="preserve">services of </w:t>
-            </w:r>
-            <w:proofErr w:type="spellStart"/>
-            <w:r>
-              <w:rPr>
-                <w:sz w:val="20"/>
-                <w:szCs w:val="20"/>
-              </w:rPr>
-              <w:t>Foodesign</w:t>
-            </w:r>
-            <w:proofErr w:type="spellEnd"/>
-            <w:r>
-              <w:rPr>
-                <w:sz w:val="20"/>
-                <w:szCs w:val="20"/>
-              </w:rPr>
-              <w:t xml:space="preserve"> Conceptual Events as listed</w:t>
-            </w:r>
-            <w:r>
-              <w:rPr>
-                <w:sz w:val="20"/>
-                <w:szCs w:val="20"/>
-              </w:rPr>
-              <w:t xml:space="preserve"> </w:t>
-            </w:r>
-            <w:r>
-              <w:rPr>
-                <w:sz w:val="20"/>
-                <w:szCs w:val="20"/>
-              </w:rPr>
-              <w:t>and quoted in this proposal on behalf of the Client according to the terms and</w:t>
-            </w:r>
-            <w:r>
-              <w:rPr>
-                <w:sz w:val="20"/>
-                <w:szCs w:val="20"/>
-              </w:rPr>
-              <w:t xml:space="preserve"> </w:t>
-            </w:r>
-            <w:r>
-              <w:rPr>
-                <w:sz w:val="20"/>
-                <w:szCs w:val="20"/>
-              </w:rPr>
-              <w:t>conditions herein.</w:t>
-            </w:r>
-          </w:p>
-          <w:p>
-            <w:pPr>
-              <w:jc w:val="both"/>
-              <w:rPr>
-                <w:b/>
-                <w:bCs/>
-                <w:sz w:val="28"/>
-                <w:szCs w:val="28"/>
-              </w:rPr>
-            </w:pPr>
-            <w:r>
-              <w:rPr>
-                <w:b/>
-                <w:bCs/>
-                <w:sz w:val="28"/>
-                <w:szCs w:val="28"/>
-              </w:rPr>
-              <w:t>Signed: _______________________________</w:t>
-            </w:r>
-          </w:p>
-          <w:p>
-            <w:pPr>
-              <w:jc w:val="both"/>
-              <w:rPr>
-                <w:b/>
-                <w:bCs/>
-                <w:sz w:val="28"/>
-                <w:szCs w:val="28"/>
-              </w:rPr>
-            </w:pPr>
-            <w:r>
-              <w:rPr>
-                <w:b/>
-                <w:bCs/>
-                <w:sz w:val="28"/>
-                <w:szCs w:val="28"/>
-              </w:rPr>
-              <w:t>Name: ________________________________</w:t>
-            </w:r>
-          </w:p>
-          <w:p>
-            <w:pPr>
-              <w:jc w:val="both"/>
-              <w:rPr>
-                <w:b/>
-                <w:bCs/>
-                <w:sz w:val="28"/>
-                <w:szCs w:val="28"/>
-              </w:rPr>
-            </w:pPr>
-            <w:r>
-              <w:rPr>
-                <w:b/>
-                <w:bCs/>
-                <w:sz w:val="28"/>
-                <w:szCs w:val="28"/>
-              </w:rPr>
-              <w:t>Data: _________________________________</w:t>
-            </w:r>
-          </w:p>
-        </w:tc>
-      </w:tr>
-    </w:tbl>
+    <w:p>
+      <w:pPr>
+        <w:rPr>
+          <w:rFonts w:ascii="Open Sans Medium" w:hAnsi="Open Sans Medium" w:cs="Open Sans Medium"/>
+          <w:color w:val="323232"/>
+          <w:sz w:val="24"/>
+          <w:szCs w:val="24"/>
+        </w:rPr>
+        <w:sectPr>
+          <w:headerReference w:type="default" r:id="rId9"/>
+          <w:headerReference w:type="first" r:id="rId12"/>
+          <w:pgSz w:w="12240" w:h="15840"/>
+          <w:pgMar w:top="1440" w:right="1800" w:bottom="1440" w:left="1800" w:header="0" w:footer="0" w:gutter="0"/>
+          <w:cols w:space="720"/>
+          <w:formProt w:val="0"/>
+          <w:titlePg/>
+          <w:docGrid w:linePitch="360" w:charSpace="4096"/>
+        </w:sectPr>
+      </w:pPr>
+    </w:p>
+    <w:p>
+      <w:pPr>
+        <w:rPr>
+          <w:rFonts w:ascii="Open Sans Medium" w:hAnsi="Open Sans Medium" w:cs="Open Sans Medium"/>
+          <w:sz w:val="20"/>
+          <w:szCs w:val="20"/>
+        </w:rPr>
+      </w:pPr>
+      <w:r>
+        <w:rPr>
+          <w:rFonts w:ascii="Open Sans Medium" w:hAnsi="Open Sans Medium" w:cs="Open Sans Medium"/>
+          <w:color w:val="323232"/>
+          <w:sz w:val="20"/>
+          <w:szCs w:val="20"/>
+        </w:rPr>
+        <w:t>Dear Rafael Guzman,</w:t>
+      </w:r>
+      <w:r>
+        <w:rPr>
+          <w:rFonts w:ascii="Open Sans Medium" w:hAnsi="Open Sans Medium" w:cs="Open Sans Medium"/>
+          <w:sz w:val="20"/>
+          <w:szCs w:val="20"/>
+        </w:rPr>
+        <w:br/>
+      </w:r>
+      <w:r>
+        <w:rPr>
+          <w:rFonts w:ascii="Open Sans Medium" w:hAnsi="Open Sans Medium" w:cs="Open Sans Medium"/>
+          <w:b/>
+          <w:color w:val="612D4B"/>
+          <w:sz w:val="20"/>
+          <w:szCs w:val="20"/>
+        </w:rPr>
+        <w:br/>
+      </w:r>
+      <w:r>
+        <w:rPr>
+          <w:rFonts w:ascii="Open Sans Medium" w:hAnsi="Open Sans Medium" w:cs="Open Sans Medium"/>
+          <w:color w:val="323232"/>
+          <w:sz w:val="20"/>
+          <w:szCs w:val="20"/>
+        </w:rPr>
+        <w:t>Thank you for the opportunity, to provide our services for your events. We look forward to sharing our services with you and your guests. Booking staff, planning and directing an event can be stressful. Therefore, we promise to do everything we can to ease the burden on you.</w:t>
+      </w:r>
+    </w:p>
+    <w:p>
+      <w:pPr>
+        <w:pStyle w:val="Default"/>
+        <w:rPr>
+          <w:rFonts w:ascii="Open Sans Medium" w:eastAsiaTheme="minorEastAsia" w:hAnsi="Open Sans Medium" w:cs="Open Sans Medium"/>
+          <w:color w:val="323232"/>
+          <w:sz w:val="20"/>
+          <w:szCs w:val="20"/>
+        </w:rPr>
+      </w:pPr>
+      <w:r>
+        <w:rPr>
+          <w:rFonts w:ascii="Open Sans Medium" w:eastAsiaTheme="minorEastAsia" w:hAnsi="Open Sans Medium" w:cs="Open Sans Medium"/>
+          <w:color w:val="323232"/>
+          <w:sz w:val="20"/>
+          <w:szCs w:val="20"/>
+        </w:rPr>
+        <w:t xml:space="preserve">We have taken all of your concerns and requests into consideration as we developed this proposal and quote. We would like to assure you that our wait </w:t>
+      </w:r>
+      <w:proofErr w:type="spellStart"/>
+      <w:proofErr w:type="gramStart"/>
+      <w:r>
+        <w:rPr>
+          <w:rFonts w:ascii="Open Sans Medium" w:eastAsiaTheme="minorEastAsia" w:hAnsi="Open Sans Medium" w:cs="Open Sans Medium"/>
+          <w:color w:val="323232"/>
+          <w:sz w:val="20"/>
+          <w:szCs w:val="20"/>
+        </w:rPr>
+        <w:t>staff,catering</w:t>
+      </w:r>
+      <w:proofErr w:type="spellEnd"/>
+      <w:proofErr w:type="gramEnd"/>
+      <w:r>
+        <w:rPr>
+          <w:rFonts w:ascii="Open Sans Medium" w:eastAsiaTheme="minorEastAsia" w:hAnsi="Open Sans Medium" w:cs="Open Sans Medium"/>
+          <w:color w:val="323232"/>
+          <w:sz w:val="20"/>
+          <w:szCs w:val="20"/>
+        </w:rPr>
+        <w:t xml:space="preserve"> and event services will meet your high food standards and suit your personal tastes.</w:t>
+      </w:r>
+    </w:p>
+    <w:p>
+      <w:pPr>
+        <w:pStyle w:val="Default"/>
+        <w:rPr>
+          <w:rFonts w:ascii="Open Sans Medium" w:eastAsiaTheme="minorEastAsia" w:hAnsi="Open Sans Medium" w:cs="Open Sans Medium"/>
+          <w:color w:val="323232"/>
+          <w:sz w:val="20"/>
+          <w:szCs w:val="20"/>
+        </w:rPr>
+      </w:pPr>
+      <w:r>
+        <w:rPr>
+          <w:rFonts w:ascii="Open Sans Medium" w:eastAsiaTheme="minorEastAsia" w:hAnsi="Open Sans Medium" w:cs="Open Sans Medium"/>
+          <w:color w:val="323232"/>
+          <w:sz w:val="20"/>
+          <w:szCs w:val="20"/>
+        </w:rPr>
+        <w:t xml:space="preserve">In this proposal, we have only included the services that you have </w:t>
+      </w:r>
+      <w:proofErr w:type="spellStart"/>
+      <w:proofErr w:type="gramStart"/>
+      <w:r>
+        <w:rPr>
+          <w:rFonts w:ascii="Open Sans Medium" w:eastAsiaTheme="minorEastAsia" w:hAnsi="Open Sans Medium" w:cs="Open Sans Medium"/>
+          <w:color w:val="323232"/>
+          <w:sz w:val="20"/>
+          <w:szCs w:val="20"/>
+        </w:rPr>
+        <w:t>selected.Please</w:t>
+      </w:r>
+      <w:proofErr w:type="spellEnd"/>
+      <w:proofErr w:type="gramEnd"/>
+      <w:r>
+        <w:rPr>
+          <w:rFonts w:ascii="Open Sans Medium" w:eastAsiaTheme="minorEastAsia" w:hAnsi="Open Sans Medium" w:cs="Open Sans Medium"/>
+          <w:color w:val="323232"/>
+          <w:sz w:val="20"/>
+          <w:szCs w:val="20"/>
+        </w:rPr>
+        <w:t xml:space="preserve"> feel free to notify us if you have any concerns or additional services </w:t>
+      </w:r>
+      <w:proofErr w:type="spellStart"/>
+      <w:r>
+        <w:rPr>
+          <w:rFonts w:ascii="Open Sans Medium" w:eastAsiaTheme="minorEastAsia" w:hAnsi="Open Sans Medium" w:cs="Open Sans Medium"/>
+          <w:color w:val="323232"/>
+          <w:sz w:val="20"/>
+          <w:szCs w:val="20"/>
+        </w:rPr>
+        <w:t>thatyou</w:t>
+      </w:r>
+      <w:proofErr w:type="spellEnd"/>
+      <w:r>
+        <w:rPr>
+          <w:rFonts w:ascii="Open Sans Medium" w:eastAsiaTheme="minorEastAsia" w:hAnsi="Open Sans Medium" w:cs="Open Sans Medium"/>
+          <w:color w:val="323232"/>
+          <w:sz w:val="20"/>
+          <w:szCs w:val="20"/>
+        </w:rPr>
+        <w:t xml:space="preserve"> would like to request. We hope that you will find this proposal to your </w:t>
+      </w:r>
+      <w:proofErr w:type="spellStart"/>
+      <w:proofErr w:type="gramStart"/>
+      <w:r>
+        <w:rPr>
+          <w:rFonts w:ascii="Open Sans Medium" w:eastAsiaTheme="minorEastAsia" w:hAnsi="Open Sans Medium" w:cs="Open Sans Medium"/>
+          <w:color w:val="323232"/>
+          <w:sz w:val="20"/>
+          <w:szCs w:val="20"/>
+        </w:rPr>
+        <w:t>liking.We</w:t>
+      </w:r>
+      <w:proofErr w:type="spellEnd"/>
+      <w:proofErr w:type="gramEnd"/>
+      <w:r>
+        <w:rPr>
+          <w:rFonts w:ascii="Open Sans Medium" w:eastAsiaTheme="minorEastAsia" w:hAnsi="Open Sans Medium" w:cs="Open Sans Medium"/>
+          <w:color w:val="323232"/>
+          <w:sz w:val="20"/>
+          <w:szCs w:val="20"/>
+        </w:rPr>
+        <w:t xml:space="preserve"> are looking forward to helping provide all your guests with an enjoyable and unforgettable experience.</w:t>
+      </w:r>
+    </w:p>
+    <w:p>
+      <w:pPr>
+        <w:pStyle w:val="Default"/>
+        <w:rPr>
+          <w:rFonts w:ascii="Open Sans Medium" w:eastAsiaTheme="minorEastAsia" w:hAnsi="Open Sans Medium" w:cs="Open Sans Medium"/>
+          <w:color w:val="323232"/>
+          <w:sz w:val="20"/>
+          <w:szCs w:val="20"/>
+        </w:rPr>
+      </w:pPr>
+      <w:r>
+        <w:rPr>
+          <w:rFonts w:ascii="Open Sans Medium" w:eastAsiaTheme="minorEastAsia" w:hAnsi="Open Sans Medium" w:cs="Open Sans Medium"/>
+          <w:color w:val="323232"/>
+          <w:sz w:val="20"/>
+          <w:szCs w:val="20"/>
+        </w:rPr>
+        <w:t>Sincerely.</w:t>
+      </w:r>
+    </w:p>
+    <w:p>
+      <w:pPr>
+        <w:pStyle w:val="Default"/>
+        <w:rPr>
+          <w:rFonts w:ascii="Open Sans Medium" w:eastAsiaTheme="minorEastAsia" w:hAnsi="Open Sans Medium" w:cs="Open Sans Medium"/>
+          <w:color w:val="323232"/>
+          <w:sz w:val="20"/>
+          <w:szCs w:val="20"/>
+        </w:rPr>
+      </w:pPr>
+      <w:r>
+        <w:rPr>
+          <w:rFonts w:ascii="Open Sans Medium" w:eastAsiaTheme="minorEastAsia" w:hAnsi="Open Sans Medium" w:cs="Open Sans Medium"/>
+          <w:color w:val="323232"/>
+          <w:sz w:val="20"/>
+          <w:szCs w:val="20"/>
+        </w:rPr>
+        <w:t>____________________________________</w:t>
+      </w:r>
+    </w:p>
+    <w:p>
+      <w:pPr>
+        <w:pStyle w:val="Default"/>
+        <w:rPr>
+          <w:rFonts w:ascii="Open Sans Medium" w:eastAsiaTheme="minorEastAsia" w:hAnsi="Open Sans Medium" w:cs="Open Sans Medium"/>
+          <w:color w:val="323232"/>
+          <w:sz w:val="20"/>
+          <w:szCs w:val="20"/>
+        </w:rPr>
+      </w:pPr>
+      <w:r>
+        <w:rPr>
+          <w:rFonts w:ascii="Open Sans Medium" w:eastAsiaTheme="minorEastAsia" w:hAnsi="Open Sans Medium" w:cs="Open Sans Medium"/>
+          <w:color w:val="323232"/>
+          <w:sz w:val="20"/>
+          <w:szCs w:val="20"/>
+        </w:rPr>
+        <w:t>Jane Doe</w:t>
+      </w:r>
+    </w:p>
+    <w:p>
+      <w:pPr>
+        <w:rPr>
+          <w:rFonts w:ascii="Open Sans Medium" w:hAnsi="Open Sans Medium" w:cs="Open Sans Medium"/>
+        </w:rPr>
+      </w:pPr>
+    </w:p>
+    <w:p>
+      <w:pPr>
+        <w:rPr>
+          <w:rFonts w:ascii="Open Sans Medium" w:hAnsi="Open Sans Medium" w:cs="Open Sans Medium"/>
+        </w:rPr>
+      </w:pPr>
+    </w:p>
+    <w:p>
+      <w:pPr>
+        <w:rPr>
+          <w:rFonts w:ascii="Open Sans Medium" w:hAnsi="Open Sans Medium" w:cs="Open Sans Medium"/>
+        </w:rPr>
+      </w:pPr>
+    </w:p>
+    <w:p>
+      <w:pPr>
+        <w:rPr>
+          <w:rFonts w:ascii="Open Sans Medium" w:hAnsi="Open Sans Medium" w:cs="Open Sans Medium"/>
+        </w:rPr>
+      </w:pPr>
+    </w:p>
+    <w:p>
+      <w:pPr>
+        <w:rPr>
+          <w:rFonts w:ascii="Open Sans Medium" w:hAnsi="Open Sans Medium" w:cs="Open Sans Medium"/>
+        </w:rPr>
+      </w:pPr>
+    </w:p>
+    <w:p>
+      <w:pPr>
+        <w:rPr>
+          <w:rFonts w:ascii="Open Sans Medium" w:hAnsi="Open Sans Medium" w:cs="Open Sans Medium"/>
+        </w:rPr>
+      </w:pPr>
+    </w:p>
+    <w:p>
+      <w:pPr>
+        <w:rPr>
+          <w:rFonts w:ascii="Open Sans Medium" w:hAnsi="Open Sans Medium" w:cs="Open Sans Medium"/>
+        </w:rPr>
+      </w:pPr>
+    </w:p>
+    <w:p>
+      <w:pPr>
+        <w:rPr>
+          <w:rFonts w:ascii="Open Sans Medium" w:hAnsi="Open Sans Medium" w:cs="Open Sans Medium"/>
+        </w:rPr>
+      </w:pPr>
+    </w:p>
+    <w:p>
+      <w:pPr>
+        <w:spacing w:line="336" w:lineRule="auto" w:after="120"/>
+        <w:jc w:val="center"/>
+      </w:pPr>
+      <w:r>
+        <w:rPr>
+          <w:rFonts w:ascii="Open Sans" w:hAnsi="Open Sans"/>
+          <w:b/>
+          <w:i w:val="0"/>
+          <w:color w:val="612D4B"/>
+          <w:sz w:val="28"/>
+          <w:u w:val="none"/>
+        </w:rPr>
+        <w:t>ANNUAL CORPORATE SUMMIT 2025</w:t>
+      </w:r>
+    </w:p>
+    <w:p>
+      <w:pPr>
+        <w:spacing w:line="336" w:lineRule="auto" w:after="120"/>
+        <w:jc w:val="center"/>
+      </w:pPr>
+      <w:r>
+        <w:rPr>
+          <w:rFonts w:ascii="Open Sans" w:hAnsi="Open Sans"/>
+          <w:b w:val="0"/>
+          <w:i w:val="0"/>
+          <w:color w:val="333333"/>
+          <w:sz w:val="22"/>
+          <w:u w:val="none"/>
+        </w:rPr>
+        <w:t>Saturday, October 14th 2025</w:t>
+      </w:r>
+    </w:p>
+    <w:p>
+      <w:pPr>
+        <w:spacing w:line="336" w:lineRule="auto" w:after="120"/>
+      </w:pPr>
+    </w:p>
+    <w:p>
+      <w:pPr>
+        <w:spacing w:line="336" w:lineRule="auto" w:after="120"/>
+      </w:pPr>
+      <w:r>
+        <w:rPr>
+          <w:rFonts w:ascii="Open Sans" w:hAnsi="Open Sans"/>
+          <w:b/>
+          <w:i w:val="0"/>
+          <w:color w:val="333333"/>
+          <w:u w:val="none"/>
+        </w:rPr>
+        <w:t>Saturday, October 14th</w:t>
+      </w:r>
+    </w:p>
+    <w:p>
+      <w:pPr>
+        <w:spacing w:line="336" w:lineRule="auto" w:after="120"/>
+      </w:pPr>
+    </w:p>
+    <w:p>
+      <w:pPr>
+        <w:spacing w:line="336" w:lineRule="auto" w:after="120"/>
+      </w:pPr>
+      <w:r>
+        <w:rPr>
+          <w:rFonts w:ascii="Open Sans" w:hAnsi="Open Sans"/>
+          <w:b/>
+          <w:i w:val="0"/>
+          <w:color w:val="612D4B"/>
+          <w:sz w:val="28"/>
+          <w:u w:val="none"/>
+        </w:rPr>
+        <w:t>BREAKFAST (8:00 AM to 10:00 AM)</w:t>
+      </w:r>
+    </w:p>
+    <w:p>
+      <w:pPr>
+        <w:spacing w:line="336" w:lineRule="auto" w:after="120"/>
+      </w:pPr>
+      <w:r>
+        <w:rPr>
+          <w:rFonts w:ascii="Open Sans" w:hAnsi="Open Sans"/>
+          <w:b w:val="0"/>
+          <w:i w:val="0"/>
+          <w:color w:val="333333"/>
+          <w:u w:val="none"/>
+        </w:rPr>
+        <w:t>Premium Continental Breakfast</w:t>
+      </w:r>
+    </w:p>
+    <w:p>
+      <w:pPr>
+        <w:spacing w:line="336" w:lineRule="auto" w:after="120"/>
+      </w:pPr>
+      <w:r>
+        <w:rPr>
+          <w:rFonts w:ascii="Open Sans" w:hAnsi="Open Sans"/>
+          <w:b/>
+          <w:i w:val="0"/>
+          <w:color w:val="333333"/>
+          <w:u w:val="single"/>
+        </w:rPr>
+        <w:t>Appetizers</w:t>
+      </w:r>
+    </w:p>
+    <w:p>
+      <w:pPr>
+        <w:spacing w:line="336" w:lineRule="auto" w:after="120"/>
+      </w:pPr>
+      <w:r>
+        <w:rPr>
+          <w:rFonts w:ascii="Open Sans" w:hAnsi="Open Sans"/>
+          <w:b w:val="0"/>
+          <w:i w:val="0"/>
+          <w:color w:val="333333"/>
+          <w:u w:val="none"/>
+        </w:rPr>
+        <w:t>Starters for the table</w:t>
+      </w:r>
+    </w:p>
+    <w:p>
+      <w:pPr>
+        <w:spacing w:line="336" w:lineRule="auto" w:after="40"/>
+        <w:ind w:left="567" w:hanging="283"/>
+      </w:pPr>
+      <w:r>
+        <w:rPr>
+          <w:rFonts w:ascii="Open Sans" w:hAnsi="Open Sans"/>
+          <w:b/>
+          <w:i w:val="0"/>
+          <w:color w:val="333333"/>
+          <w:sz w:val="26"/>
+          <w:u w:val="none"/>
+        </w:rPr>
+        <w:t xml:space="preserve">• </w:t>
+      </w:r>
+      <w:r>
+        <w:rPr>
+          <w:rFonts w:ascii="Open Sans" w:hAnsi="Open Sans"/>
+          <w:b/>
+          <w:i w:val="0"/>
+          <w:color w:val="333333"/>
+          <w:sz w:val="26"/>
+          <w:u w:val="single"/>
+        </w:rPr>
+        <w:t>Bruschetta</w:t>
+      </w:r>
+      <w:r>
+        <w:rPr>
+          <w:rFonts w:ascii="Open Sans" w:hAnsi="Open Sans"/>
+          <w:b w:val="0"/>
+          <w:i w:val="0"/>
+          <w:color w:val="612D4B"/>
+          <w:sz w:val="22"/>
+          <w:u w:val="none"/>
+        </w:rPr>
+        <w:t xml:space="preserve"> (VG)</w:t>
+      </w:r>
+    </w:p>
+    <w:p>
+      <w:pPr>
+        <w:spacing w:line="336" w:lineRule="auto" w:after="160"/>
+        <w:ind w:left="567"/>
+      </w:pPr>
+      <w:r>
+        <w:rPr>
+          <w:rFonts w:ascii="Open Sans" w:hAnsi="Open Sans"/>
+          <w:b w:val="0"/>
+          <w:i/>
+          <w:color w:val="555555"/>
+          <w:sz w:val="20"/>
+          <w:u w:val="none"/>
+        </w:rPr>
+        <w:t>Chopped tomatoes, basil, and garlic on toasted focaccia</w:t>
+      </w:r>
+    </w:p>
+    <w:p>
+      <w:pPr>
+        <w:spacing w:line="336" w:lineRule="auto" w:after="40"/>
+        <w:ind w:left="567" w:hanging="283"/>
+      </w:pPr>
+      <w:r>
+        <w:rPr>
+          <w:rFonts w:ascii="Open Sans" w:hAnsi="Open Sans"/>
+          <w:b/>
+          <w:i w:val="0"/>
+          <w:color w:val="333333"/>
+          <w:sz w:val="26"/>
+          <w:u w:val="none"/>
+        </w:rPr>
+        <w:t xml:space="preserve">• </w:t>
+      </w:r>
+      <w:r>
+        <w:rPr>
+          <w:rFonts w:ascii="Open Sans" w:hAnsi="Open Sans"/>
+          <w:b/>
+          <w:i w:val="0"/>
+          <w:color w:val="333333"/>
+          <w:sz w:val="26"/>
+          <w:u w:val="single"/>
+        </w:rPr>
+        <w:t>Mini Meatballs</w:t>
+      </w:r>
+    </w:p>
+    <w:p>
+      <w:pPr>
+        <w:spacing w:line="336" w:lineRule="auto" w:after="160"/>
+        <w:ind w:left="567"/>
+      </w:pPr>
+      <w:r>
+        <w:rPr>
+          <w:rFonts w:ascii="Open Sans" w:hAnsi="Open Sans"/>
+          <w:b w:val="0"/>
+          <w:i/>
+          <w:color w:val="555555"/>
+          <w:sz w:val="20"/>
+          <w:u w:val="none"/>
+        </w:rPr>
+        <w:t>With marinara dipping sauce</w:t>
+      </w:r>
+    </w:p>
+    <w:p>
+      <w:pPr>
+        <w:spacing w:line="336" w:lineRule="auto" w:after="120"/>
+      </w:pPr>
+      <w:r>
+        <w:rPr>
+          <w:rFonts w:ascii="Open Sans" w:hAnsi="Open Sans"/>
+          <w:b/>
+          <w:i w:val="0"/>
+          <w:color w:val="333333"/>
+          <w:u w:val="single"/>
+        </w:rPr>
+        <w:t>Main Course</w:t>
+      </w:r>
+    </w:p>
+    <w:p>
+      <w:pPr>
+        <w:spacing w:line="336" w:lineRule="auto" w:after="120"/>
+      </w:pPr>
+      <w:r>
+        <w:rPr>
+          <w:rFonts w:ascii="Open Sans" w:hAnsi="Open Sans"/>
+          <w:b w:val="0"/>
+          <w:i w:val="0"/>
+          <w:color w:val="333333"/>
+          <w:u w:val="none"/>
+        </w:rPr>
+        <w:t>The big event</w:t>
+      </w:r>
+    </w:p>
+    <w:p>
+      <w:pPr>
+        <w:spacing w:line="336" w:lineRule="auto" w:after="40"/>
+        <w:ind w:left="567" w:hanging="283"/>
+      </w:pPr>
+      <w:r>
+        <w:rPr>
+          <w:rFonts w:ascii="Open Sans" w:hAnsi="Open Sans"/>
+          <w:b/>
+          <w:i w:val="0"/>
+          <w:color w:val="333333"/>
+          <w:sz w:val="26"/>
+          <w:u w:val="none"/>
+        </w:rPr>
+        <w:t xml:space="preserve">• </w:t>
+      </w:r>
+      <w:r>
+        <w:rPr>
+          <w:rFonts w:ascii="Open Sans" w:hAnsi="Open Sans"/>
+          <w:b/>
+          <w:i w:val="0"/>
+          <w:color w:val="333333"/>
+          <w:sz w:val="26"/>
+          <w:u w:val="single"/>
+        </w:rPr>
+        <w:t>Grilled Lemon Herb Chicken</w:t>
+      </w:r>
+      <w:r>
+        <w:rPr>
+          <w:rFonts w:ascii="Open Sans" w:hAnsi="Open Sans"/>
+          <w:b w:val="0"/>
+          <w:i w:val="0"/>
+          <w:color w:val="612D4B"/>
+          <w:sz w:val="22"/>
+          <w:u w:val="none"/>
+        </w:rPr>
+        <w:t xml:space="preserve"> (GF)</w:t>
+      </w:r>
+    </w:p>
+    <w:p>
+      <w:pPr>
+        <w:spacing w:line="336" w:lineRule="auto" w:after="120"/>
+      </w:pPr>
+    </w:p>
+    <w:p>
+      <w:pPr>
+        <w:spacing w:line="336" w:lineRule="auto" w:after="120"/>
+      </w:pPr>
+      <w:r>
+        <w:rPr>
+          <w:rFonts w:ascii="Open Sans" w:hAnsi="Open Sans"/>
+          <w:b/>
+          <w:i w:val="0"/>
+          <w:color w:val="612D4B"/>
+          <w:sz w:val="28"/>
+          <w:u w:val="none"/>
+        </w:rPr>
+        <w:t>Estimation</w:t>
+      </w:r>
+    </w:p>
+    <w:p>
+      <w:pPr>
+        <w:spacing w:line="336" w:lineRule="auto" w:after="120"/>
+      </w:pPr>
+      <w:r>
+        <w:rPr>
+          <w:b/>
+        </w:rPr>
+        <w:t xml:space="preserve">Food: </w:t>
+      </w:r>
+      <w:r>
+        <w:t>$5,000.00</w:t>
+      </w:r>
+    </w:p>
+    <w:p>
+      <w:pPr>
+        <w:spacing w:line="336" w:lineRule="auto" w:after="120"/>
+      </w:pPr>
+      <w:r>
+        <w:rPr>
+          <w:b/>
+        </w:rPr>
+        <w:t xml:space="preserve">Labor Cost: </w:t>
+      </w:r>
+      <w:r>
+        <w:t>$1,400.00</w:t>
+      </w:r>
+    </w:p>
+    <w:p>
+      <w:pPr>
+        <w:spacing w:line="336" w:lineRule="auto" w:after="120"/>
+      </w:pPr>
+      <w:r>
+        <w:rPr>
+          <w:b/>
+        </w:rPr>
+        <w:t xml:space="preserve">Extras Services: </w:t>
+      </w:r>
+      <w:r>
+        <w:t>$1,250.00</w:t>
+      </w:r>
+    </w:p>
+    <w:p>
+      <w:pPr>
+        <w:spacing w:line="336" w:lineRule="auto" w:after="120"/>
+      </w:pPr>
+      <w:r>
+        <w:rPr>
+          <w:b/>
+        </w:rPr>
+        <w:t xml:space="preserve">8.875% NY State Tax: </w:t>
+      </w:r>
+      <w:r>
+        <w:t>$678.94</w:t>
+      </w:r>
+    </w:p>
+    <w:p>
+      <w:pPr>
+        <w:spacing w:line="336" w:lineRule="auto" w:after="120"/>
+      </w:pPr>
+      <w:r>
+        <w:rPr>
+          <w:b/>
+        </w:rPr>
+        <w:t xml:space="preserve">18% Service Charge: </w:t>
+      </w:r>
+      <w:r>
+        <w:t>$1,377.00</w:t>
+      </w:r>
+    </w:p>
+    <w:p>
+      <w:pPr>
+        <w:spacing w:line="336" w:lineRule="auto" w:after="120"/>
+        <w:pBdr>
+          <w:top w:val="single" w:sz="12" w:space="4" w:color="612D4B"/>
+        </w:pBdr>
+      </w:pPr>
+      <w:r>
+        <w:rPr>
+          <w:rFonts w:ascii="Open Sans" w:hAnsi="Open Sans"/>
+          <w:b/>
+          <w:i w:val="0"/>
+          <w:color w:val="612D4B"/>
+          <w:sz w:val="26"/>
+          <w:u w:val="none"/>
+        </w:rPr>
+        <w:t>Total Estimate: $10,005.94</w:t>
+      </w:r>
+    </w:p>
+    <w:p>
+      <w:pPr>
+        <w:spacing w:after="0" w:line="240" w:lineRule="auto"/>
+        <w:rPr>
+          <w:rFonts w:ascii="Open Sans Medium" w:hAnsi="Open Sans Medium" w:cs="Open Sans Medium"/>
+        </w:rPr>
+      </w:pPr>
+      <w:r>
+        <w:rPr>
+          <w:rFonts w:ascii="Open Sans Medium" w:hAnsi="Open Sans Medium" w:cs="Open Sans Medium"/>
+        </w:rPr>
+        <w:br w:type="page"/>
+      </w:r>
+    </w:p>
+    <w:p>
+      <w:pPr>
+        <w:rPr>
+          <w:rFonts w:ascii="Open Sans Medium" w:hAnsi="Open Sans Medium" w:cs="Open Sans Medium"/>
+          <w:b/>
+          <w:color w:val="612D4B"/>
+          <w:sz w:val="24"/>
+          <w:szCs w:val="24"/>
+        </w:rPr>
+      </w:pPr>
+      <w:r>
+        <w:rPr>
+          <w:rFonts w:ascii="Open Sans Medium" w:hAnsi="Open Sans Medium" w:cs="Open Sans Medium"/>
+          <w:b/>
+          <w:color w:val="612D4B"/>
+          <w:sz w:val="24"/>
+          <w:szCs w:val="24"/>
+        </w:rPr>
+        <w:lastRenderedPageBreak/>
+        <w:t>Explanation of Fees</w:t>
+      </w:r>
+    </w:p>
+    <w:p>
+      <w:pPr>
+        <w:rPr>
+          <w:rFonts w:ascii="Open Sans Medium" w:hAnsi="Open Sans Medium" w:cs="Open Sans Medium"/>
+          <w:b/>
+          <w:bCs/>
+          <w:sz w:val="18"/>
+          <w:szCs w:val="18"/>
+        </w:rPr>
+      </w:pPr>
+      <w:r>
+        <w:rPr>
+          <w:rFonts w:ascii="Open Sans Medium" w:hAnsi="Open Sans Medium" w:cs="Open Sans Medium"/>
+          <w:b/>
+          <w:bCs/>
+          <w:sz w:val="18"/>
+          <w:szCs w:val="18"/>
+        </w:rPr>
+        <w:t>Event Planning Service</w:t>
+      </w:r>
+    </w:p>
+    <w:p>
+      <w:pPr>
+        <w:jc w:val="both"/>
+        <w:rPr>
+          <w:rFonts w:ascii="Open Sans Medium" w:hAnsi="Open Sans Medium" w:cs="Open Sans Medium"/>
+          <w:sz w:val="18"/>
+          <w:szCs w:val="18"/>
+        </w:rPr>
+      </w:pPr>
+      <w:r>
+        <w:rPr>
+          <w:rFonts w:ascii="Open Sans Medium" w:hAnsi="Open Sans Medium" w:cs="Open Sans Medium"/>
+          <w:sz w:val="18"/>
+          <w:szCs w:val="18"/>
+        </w:rPr>
+        <w:t xml:space="preserve">If a client </w:t>
+      </w:r>
+      <w:proofErr w:type="spellStart"/>
+      <w:r>
+        <w:rPr>
+          <w:rFonts w:ascii="Open Sans Medium" w:hAnsi="Open Sans Medium" w:cs="Open Sans Medium"/>
+          <w:sz w:val="18"/>
+          <w:szCs w:val="18"/>
+        </w:rPr>
+        <w:t>resquets</w:t>
+      </w:r>
+      <w:proofErr w:type="spellEnd"/>
+      <w:r>
+        <w:rPr>
+          <w:rFonts w:ascii="Open Sans Medium" w:hAnsi="Open Sans Medium" w:cs="Open Sans Medium"/>
+          <w:sz w:val="18"/>
+          <w:szCs w:val="18"/>
+        </w:rPr>
+        <w:t xml:space="preserve"> that the caterer </w:t>
+      </w:r>
+      <w:proofErr w:type="gramStart"/>
+      <w:r>
+        <w:rPr>
+          <w:rFonts w:ascii="Open Sans Medium" w:hAnsi="Open Sans Medium" w:cs="Open Sans Medium"/>
+          <w:sz w:val="18"/>
+          <w:szCs w:val="18"/>
+        </w:rPr>
+        <w:t>coordinate</w:t>
+      </w:r>
+      <w:proofErr w:type="gramEnd"/>
+      <w:r>
+        <w:rPr>
+          <w:rFonts w:ascii="Open Sans Medium" w:hAnsi="Open Sans Medium" w:cs="Open Sans Medium"/>
+          <w:sz w:val="18"/>
+          <w:szCs w:val="18"/>
+        </w:rPr>
+        <w:t xml:space="preserve"> the venue rental &amp; décor, entertainment, photography, valet parking, flower arranging, or other aspects of planning the event, there will be a small fee charged for this service to account for the labor needed to plan the event as agreed upon in writing by the parties at the time of such request.</w:t>
+      </w:r>
+    </w:p>
+    <w:p>
+      <w:pPr>
+        <w:rPr>
+          <w:rFonts w:ascii="Open Sans Medium" w:hAnsi="Open Sans Medium" w:cs="Open Sans Medium"/>
+          <w:b/>
+          <w:bCs/>
+          <w:sz w:val="18"/>
+          <w:szCs w:val="18"/>
+        </w:rPr>
+      </w:pPr>
+      <w:r>
+        <w:rPr>
+          <w:rFonts w:ascii="Open Sans Medium" w:hAnsi="Open Sans Medium" w:cs="Open Sans Medium"/>
+          <w:b/>
+          <w:bCs/>
+          <w:sz w:val="18"/>
+          <w:szCs w:val="18"/>
+        </w:rPr>
+        <w:t>Delivery Fee</w:t>
+      </w:r>
+    </w:p>
+    <w:p>
+      <w:pPr>
+        <w:rPr>
+          <w:rFonts w:ascii="Open Sans Medium" w:hAnsi="Open Sans Medium" w:cs="Open Sans Medium"/>
+          <w:sz w:val="18"/>
+          <w:szCs w:val="18"/>
+        </w:rPr>
+      </w:pPr>
+      <w:r>
+        <w:rPr>
+          <w:rFonts w:ascii="Open Sans Medium" w:hAnsi="Open Sans Medium" w:cs="Open Sans Medium"/>
+          <w:sz w:val="18"/>
+          <w:szCs w:val="18"/>
+        </w:rPr>
+        <w:t>Not Applicable</w:t>
+      </w:r>
+    </w:p>
+    <w:p>
+      <w:pPr>
+        <w:rPr>
+          <w:rFonts w:ascii="Open Sans Medium" w:hAnsi="Open Sans Medium" w:cs="Open Sans Medium"/>
+          <w:b/>
+          <w:bCs/>
+          <w:sz w:val="18"/>
+          <w:szCs w:val="18"/>
+        </w:rPr>
+      </w:pPr>
+      <w:r>
+        <w:rPr>
+          <w:rFonts w:ascii="Open Sans Medium" w:hAnsi="Open Sans Medium" w:cs="Open Sans Medium"/>
+          <w:b/>
+          <w:bCs/>
+          <w:sz w:val="18"/>
+          <w:szCs w:val="18"/>
+        </w:rPr>
+        <w:t>Service Charge</w:t>
+      </w:r>
+    </w:p>
+    <w:p>
+      <w:pPr>
+        <w:jc w:val="both"/>
+        <w:rPr>
+          <w:rFonts w:ascii="Open Sans Medium" w:hAnsi="Open Sans Medium" w:cs="Open Sans Medium"/>
+          <w:sz w:val="18"/>
+          <w:szCs w:val="18"/>
+        </w:rPr>
+      </w:pPr>
+      <w:r>
+        <w:rPr>
+          <w:rFonts w:ascii="Open Sans Medium" w:hAnsi="Open Sans Medium" w:cs="Open Sans Medium"/>
+          <w:sz w:val="18"/>
+          <w:szCs w:val="18"/>
+        </w:rPr>
+        <w:t>A service charge of 18,00 % is Indicated in your proposal of service. This fee covers all administration, insurance fees, transportation, site visits, trucking, &amp; supplemental costs associated with the event planning.</w:t>
+      </w:r>
+    </w:p>
+    <w:p>
+      <w:pPr>
+        <w:rPr>
+          <w:rFonts w:ascii="Open Sans Medium" w:hAnsi="Open Sans Medium" w:cs="Open Sans Medium"/>
+          <w:b/>
+          <w:bCs/>
+          <w:sz w:val="18"/>
+          <w:szCs w:val="18"/>
+        </w:rPr>
+      </w:pPr>
+      <w:r>
+        <w:rPr>
+          <w:rFonts w:ascii="Open Sans Medium" w:hAnsi="Open Sans Medium" w:cs="Open Sans Medium"/>
+          <w:b/>
+          <w:bCs/>
+          <w:sz w:val="18"/>
+          <w:szCs w:val="18"/>
+        </w:rPr>
+        <w:t>Gratuities</w:t>
+      </w:r>
+    </w:p>
+    <w:p>
+      <w:pPr>
+        <w:jc w:val="both"/>
+        <w:rPr>
+          <w:rFonts w:ascii="Open Sans Medium" w:hAnsi="Open Sans Medium" w:cs="Open Sans Medium"/>
+          <w:sz w:val="18"/>
+          <w:szCs w:val="18"/>
+        </w:rPr>
+      </w:pPr>
+      <w:r>
+        <w:rPr>
+          <w:rFonts w:ascii="Open Sans Medium" w:hAnsi="Open Sans Medium" w:cs="Open Sans Medium"/>
+          <w:sz w:val="18"/>
+          <w:szCs w:val="18"/>
+        </w:rPr>
+        <w:t>Gratuities are not included in the proposal and are at the sole discretion of the client.</w:t>
+      </w:r>
+    </w:p>
+    <w:p>
+      <w:pPr>
+        <w:rPr>
+          <w:rFonts w:ascii="Open Sans Medium" w:hAnsi="Open Sans Medium" w:cs="Open Sans Medium"/>
+          <w:b/>
+          <w:bCs/>
+          <w:sz w:val="18"/>
+          <w:szCs w:val="18"/>
+        </w:rPr>
+      </w:pPr>
+      <w:r>
+        <w:rPr>
+          <w:rFonts w:ascii="Open Sans Medium" w:hAnsi="Open Sans Medium" w:cs="Open Sans Medium"/>
+          <w:b/>
+          <w:bCs/>
+          <w:sz w:val="18"/>
+          <w:szCs w:val="18"/>
+        </w:rPr>
+        <w:t>Taxes and Insurance</w:t>
+      </w:r>
+    </w:p>
+    <w:p>
+      <w:pPr>
+        <w:rPr>
+          <w:rFonts w:ascii="Open Sans Medium" w:hAnsi="Open Sans Medium" w:cs="Open Sans Medium"/>
+          <w:sz w:val="18"/>
+          <w:szCs w:val="18"/>
+        </w:rPr>
+      </w:pPr>
+      <w:r>
+        <w:rPr>
+          <w:rFonts w:ascii="Open Sans Medium" w:hAnsi="Open Sans Medium" w:cs="Open Sans Medium"/>
+          <w:sz w:val="18"/>
+          <w:szCs w:val="18"/>
+        </w:rPr>
+        <w:t>All prices are subject to a 18,00 % service and</w:t>
+      </w:r>
+    </w:p>
+    <w:p>
+      <w:pPr>
+        <w:rPr>
+          <w:rFonts w:ascii="Open Sans Medium" w:hAnsi="Open Sans Medium" w:cs="Open Sans Medium"/>
+          <w:b/>
+          <w:bCs/>
+          <w:sz w:val="18"/>
+          <w:szCs w:val="18"/>
+        </w:rPr>
+      </w:pPr>
+      <w:r>
+        <w:rPr>
+          <w:rFonts w:ascii="Open Sans Medium" w:hAnsi="Open Sans Medium" w:cs="Open Sans Medium"/>
+          <w:b/>
+          <w:bCs/>
+          <w:sz w:val="18"/>
+          <w:szCs w:val="18"/>
+        </w:rPr>
+        <w:t>Governing Terms</w:t>
+      </w:r>
+    </w:p>
+    <w:p>
+      <w:pPr>
+        <w:jc w:val="both"/>
+        <w:rPr>
+          <w:rFonts w:ascii="Open Sans Medium" w:hAnsi="Open Sans Medium" w:cs="Open Sans Medium"/>
+          <w:sz w:val="18"/>
+          <w:szCs w:val="18"/>
+        </w:rPr>
+      </w:pPr>
+      <w:proofErr w:type="spellStart"/>
+      <w:r>
+        <w:rPr>
+          <w:rFonts w:ascii="Open Sans Medium" w:hAnsi="Open Sans Medium" w:cs="Open Sans Medium"/>
+          <w:sz w:val="18"/>
+          <w:szCs w:val="18"/>
+        </w:rPr>
+        <w:t>Foodesign</w:t>
+      </w:r>
+      <w:proofErr w:type="spellEnd"/>
+      <w:r>
+        <w:rPr>
+          <w:rFonts w:ascii="Open Sans Medium" w:hAnsi="Open Sans Medium" w:cs="Open Sans Medium"/>
+          <w:sz w:val="18"/>
+          <w:szCs w:val="18"/>
+        </w:rPr>
+        <w:t xml:space="preserve"> Conceptual Events and the Client acknowledge and agree that this proposal is governed by the Master Caterer Agreement executed between the parties.</w:t>
+      </w:r>
+    </w:p>
+    <w:p>
+      <w:pPr>
+        <w:rPr>
+          <w:rFonts w:ascii="Open Sans Medium" w:hAnsi="Open Sans Medium" w:cs="Open Sans Medium"/>
+          <w:b/>
+          <w:bCs/>
+          <w:sz w:val="18"/>
+          <w:szCs w:val="18"/>
+        </w:rPr>
+      </w:pPr>
+      <w:r>
+        <w:rPr>
+          <w:rFonts w:ascii="Open Sans Medium" w:hAnsi="Open Sans Medium" w:cs="Open Sans Medium"/>
+          <w:b/>
+          <w:bCs/>
+          <w:sz w:val="18"/>
+          <w:szCs w:val="18"/>
+        </w:rPr>
+        <w:t>Acceptance By Client</w:t>
+      </w:r>
+    </w:p>
+    <w:p>
+      <w:pPr>
+        <w:jc w:val="both"/>
+        <w:rPr>
+          <w:rFonts w:ascii="Open Sans Medium" w:hAnsi="Open Sans Medium" w:cs="Open Sans Medium"/>
+          <w:sz w:val="18"/>
+          <w:szCs w:val="18"/>
+        </w:rPr>
+      </w:pPr>
+      <w:r>
+        <w:rPr>
+          <w:rFonts w:ascii="Open Sans Medium" w:hAnsi="Open Sans Medium" w:cs="Open Sans Medium"/>
+          <w:sz w:val="18"/>
+          <w:szCs w:val="18"/>
+        </w:rPr>
+        <w:t xml:space="preserve">The undersigned, as a duly authorized representative of the Client, Math for America, hereby contract the services of </w:t>
+      </w:r>
+      <w:proofErr w:type="spellStart"/>
+      <w:r>
+        <w:rPr>
+          <w:rFonts w:ascii="Open Sans Medium" w:hAnsi="Open Sans Medium" w:cs="Open Sans Medium"/>
+          <w:sz w:val="18"/>
+          <w:szCs w:val="18"/>
+        </w:rPr>
+        <w:t>Foodesign</w:t>
+      </w:r>
+      <w:proofErr w:type="spellEnd"/>
+      <w:r>
+        <w:rPr>
+          <w:rFonts w:ascii="Open Sans Medium" w:hAnsi="Open Sans Medium" w:cs="Open Sans Medium"/>
+          <w:sz w:val="18"/>
+          <w:szCs w:val="18"/>
+        </w:rPr>
+        <w:t xml:space="preserve"> Conceptual Events as listed and quoted in this proposal on behalf of the Client according to the terms and conditions herein.</w:t>
+      </w:r>
+    </w:p>
+    <w:p>
+      <w:pPr>
+        <w:jc w:val="both"/>
+        <w:rPr>
+          <w:rFonts w:ascii="Open Sans Medium" w:hAnsi="Open Sans Medium" w:cs="Open Sans Medium"/>
+          <w:b/>
+          <w:bCs/>
+          <w:sz w:val="20"/>
+          <w:szCs w:val="20"/>
+        </w:rPr>
+      </w:pPr>
+      <w:r>
+        <w:rPr>
+          <w:rFonts w:ascii="Open Sans Medium" w:hAnsi="Open Sans Medium" w:cs="Open Sans Medium"/>
+          <w:b/>
+          <w:bCs/>
+          <w:sz w:val="20"/>
+          <w:szCs w:val="20"/>
+        </w:rPr>
+        <w:t>Signed: _______________________________</w:t>
+      </w:r>
+    </w:p>
+    <w:p>
+      <w:pPr>
+        <w:jc w:val="both"/>
+        <w:rPr>
+          <w:rFonts w:ascii="Open Sans Medium" w:hAnsi="Open Sans Medium" w:cs="Open Sans Medium"/>
+          <w:b/>
+          <w:bCs/>
+          <w:sz w:val="20"/>
+          <w:szCs w:val="20"/>
+        </w:rPr>
+      </w:pPr>
+      <w:r>
+        <w:rPr>
+          <w:rFonts w:ascii="Open Sans Medium" w:hAnsi="Open Sans Medium" w:cs="Open Sans Medium"/>
+          <w:b/>
+          <w:bCs/>
+          <w:sz w:val="20"/>
+          <w:szCs w:val="20"/>
+        </w:rPr>
+        <w:t>Name: ________________________________</w:t>
+      </w:r>
+    </w:p>
     <w:p>
       <w:pPr>
         <w:pStyle w:val="Ttulo1"/>
         <w:spacing w:before="0"/>
+        <w:rPr>
+          <w:rFonts w:ascii="Open Sans Medium" w:hAnsi="Open Sans Medium" w:cs="Open Sans Medium"/>
+          <w:sz w:val="20"/>
+          <w:szCs w:val="20"/>
+        </w:rPr>
+      </w:pPr>
+      <w:r>
+        <w:rPr>
+          <w:rFonts w:ascii="Open Sans Medium" w:hAnsi="Open Sans Medium" w:cs="Open Sans Medium"/>
+          <w:sz w:val="20"/>
+          <w:szCs w:val="20"/>
+        </w:rPr>
+        <w:t>Data: _________________________________</w:t>
+      </w:r>
+    </w:p>
+    <w:p>
+      <w:pPr>
+        <w:rPr>
+          <w:rFonts w:ascii="Open Sans Medium" w:hAnsi="Open Sans Medium" w:cs="Open Sans Medium"/>
+        </w:rPr>
       </w:pPr>
     </w:p>
     <w:sectPr>
       <w:pgSz w:w="12240" w:h="15840"/>
-      <w:pgMar w:top="1440" w:right="1800" w:bottom="1440" w:left="1800" w:header="0" w:footer="0" w:gutter="0"/>
+      <w:pgMar w:top="1440" w:right="1800" w:bottom="1440" w:left="4608" w:header="0" w:footer="0" w:gutter="0"/>
       <w:cols w:space="720"/>
       <w:formProt w:val="0"/>
-      <w:titlePg/>
       <w:docGrid w:linePitch="360" w:charSpace="4096"/>
     </w:sectPr>
   </w:body>
 </w:document>
+</file>
+
+<file path=word/endnotes.xml><?xml version="1.0" encoding="utf-8"?>
+<w:endnotes xmlns:wpc="http://schemas.microsoft.com/office/word/2010/wordprocessingCanvas" xmlns:cx="http://schemas.microsoft.com/office/drawing/2014/chartex" xmlns:cx1="http://schemas.microsoft.com/office/drawing/2015/9/8/chartex" xmlns:cx2="http://schemas.microsoft.com/office/drawing/2015/10/21/chartex" xmlns:cx3="http://schemas.microsoft.com/office/drawing/2016/5/9/chartex" xmlns:cx4="http://schemas.microsoft.com/office/drawing/2016/5/10/chartex" xmlns:cx5="http://schemas.microsoft.com/office/drawing/2016/5/11/chartex" xmlns:cx6="http://schemas.microsoft.com/office/drawing/2016/5/12/chartex" xmlns:cx7="http://schemas.microsoft.com/office/drawing/2016/5/13/chartex" xmlns:cx8="http://schemas.microsoft.com/office/drawing/2016/5/14/chartex" xmlns:mc="http://schemas.openxmlformats.org/markup-compatibility/2006" xmlns:aink="http://schemas.microsoft.com/office/drawing/2016/ink" xmlns:am3d="http://schemas.microsoft.com/office/drawing/2017/model3d" xmlns:o="urn:schemas-microsoft-com:office:office" xmlns:oel="http://schemas.microsoft.com/office/2019/extlst" xmlns:r="http://schemas.openxmlformats.org/officeDocument/2006/relationships" xmlns:m="http://schemas.openxmlformats.org/officeDocument/2006/math" xmlns:v="urn:schemas-microsoft-com:vml" xmlns:wp14="http://schemas.microsoft.com/office/word/2010/wordprocessingDrawing" xmlns:wp="http://schemas.openxmlformats.org/drawingml/2006/wordprocessingDrawing" xmlns:w10="urn:schemas-microsoft-com:office:word" xmlns:w="http://schemas.openxmlformats.org/wordprocessingml/2006/main" xmlns:w14="http://schemas.microsoft.com/office/word/2010/wordml" xmlns:w15="http://schemas.microsoft.com/office/word/2012/wordml" xmlns:w16cex="http://schemas.microsoft.com/office/word/2018/wordml/cex" xmlns:w16cid="http://schemas.microsoft.com/office/word/2016/wordml/cid" xmlns:w16="http://schemas.microsoft.com/office/word/2018/wordml" xmlns:w16du="http://schemas.microsoft.com/office/word/2023/wordml/word16du" xmlns:w16sdtdh="http://schemas.microsoft.com/office/word/2020/wordml/sdtdatahash" xmlns:w16sdtfl="http://schemas.microsoft.com/office/word/2024/wordml/sdtformatlock" xmlns:w16se="http://schemas.microsoft.com/office/word/2015/wordml/symex" xmlns:wpg="http://schemas.microsoft.com/office/word/2010/wordprocessingGroup" xmlns:wpi="http://schemas.microsoft.com/office/word/2010/wordprocessingInk" xmlns:wne="http://schemas.microsoft.com/office/word/2006/wordml" xmlns:wps="http://schemas.microsoft.com/office/word/2010/wordprocessingShape" mc:Ignorable="w14 w15 w16se w16cid w16 w16cex w16sdtdh w16sdtfl w16du wp14">
+  <w:endnote w:type="separator" w:id="-1">
+    <w:p>
+      <w:pPr>
+        <w:spacing w:after="0" w:line="240" w:lineRule="auto"/>
+      </w:pPr>
+      <w:r>
+        <w:separator/>
+      </w:r>
+    </w:p>
+  </w:endnote>
+  <w:endnote w:type="continuationSeparator" w:id="0">
+    <w:p>
+      <w:pPr>
+        <w:spacing w:after="0" w:line="240" w:lineRule="auto"/>
+      </w:pPr>
+      <w:r>
+        <w:continuationSeparator/>
+      </w:r>
+    </w:p>
+  </w:endnote>
+</w:endnotes>
+</file>
+
+<file path=word/footnotes.xml><?xml version="1.0" encoding="utf-8"?>
+<w:footnotes xmlns:wpc="http://schemas.microsoft.com/office/word/2010/wordprocessingCanvas" xmlns:cx="http://schemas.microsoft.com/office/drawing/2014/chartex" xmlns:cx1="http://schemas.microsoft.com/office/drawing/2015/9/8/chartex" xmlns:cx2="http://schemas.microsoft.com/office/drawing/2015/10/21/chartex" xmlns:cx3="http://schemas.microsoft.com/office/drawing/2016/5/9/chartex" xmlns:cx4="http://schemas.microsoft.com/office/drawing/2016/5/10/chartex" xmlns:cx5="http://schemas.microsoft.com/office/drawing/2016/5/11/chartex" xmlns:cx6="http://schemas.microsoft.com/office/drawing/2016/5/12/chartex" xmlns:cx7="http://schemas.microsoft.com/office/drawing/2016/5/13/chartex" xmlns:cx8="http://schemas.microsoft.com/office/drawing/2016/5/14/chartex" xmlns:mc="http://schemas.openxmlformats.org/markup-compatibility/2006" xmlns:aink="http://schemas.microsoft.com/office/drawing/2016/ink" xmlns:am3d="http://schemas.microsoft.com/office/drawing/2017/model3d" xmlns:o="urn:schemas-microsoft-com:office:office" xmlns:oel="http://schemas.microsoft.com/office/2019/extlst" xmlns:r="http://schemas.openxmlformats.org/officeDocument/2006/relationships" xmlns:m="http://schemas.openxmlformats.org/officeDocument/2006/math" xmlns:v="urn:schemas-microsoft-com:vml" xmlns:wp14="http://schemas.microsoft.com/office/word/2010/wordprocessingDrawing" xmlns:wp="http://schemas.openxmlformats.org/drawingml/2006/wordprocessingDrawing" xmlns:w10="urn:schemas-microsoft-com:office:word" xmlns:w="http://schemas.openxmlformats.org/wordprocessingml/2006/main" xmlns:w14="http://schemas.microsoft.com/office/word/2010/wordml" xmlns:w15="http://schemas.microsoft.com/office/word/2012/wordml" xmlns:w16cex="http://schemas.microsoft.com/office/word/2018/wordml/cex" xmlns:w16cid="http://schemas.microsoft.com/office/word/2016/wordml/cid" xmlns:w16="http://schemas.microsoft.com/office/word/2018/wordml" xmlns:w16du="http://schemas.microsoft.com/office/word/2023/wordml/word16du" xmlns:w16sdtdh="http://schemas.microsoft.com/office/word/2020/wordml/sdtdatahash" xmlns:w16sdtfl="http://schemas.microsoft.com/office/word/2024/wordml/sdtformatlock" xmlns:w16se="http://schemas.microsoft.com/office/word/2015/wordml/symex" xmlns:wpg="http://schemas.microsoft.com/office/word/2010/wordprocessingGroup" xmlns:wpi="http://schemas.microsoft.com/office/word/2010/wordprocessingInk" xmlns:wne="http://schemas.microsoft.com/office/word/2006/wordml" xmlns:wps="http://schemas.microsoft.com/office/word/2010/wordprocessingShape" mc:Ignorable="w14 w15 w16se w16cid w16 w16cex w16sdtdh w16sdtfl w16du wp14">
+  <w:footnote w:type="separator" w:id="-1">
+    <w:p>
+      <w:pPr>
+        <w:spacing w:after="0" w:line="240" w:lineRule="auto"/>
+      </w:pPr>
+      <w:r>
+        <w:separator/>
+      </w:r>
+    </w:p>
+  </w:footnote>
+  <w:footnote w:type="continuationSeparator" w:id="0">
+    <w:p>
+      <w:pPr>
+        <w:spacing w:after="0" w:line="240" w:lineRule="auto"/>
+      </w:pPr>
+      <w:r>
+        <w:continuationSeparator/>
+      </w:r>
+    </w:p>
+  </w:footnote>
+</w:footnotes>
+</file>
+
+<file path=word/header1.xml><?xml version="1.0" encoding="utf-8"?>
+<w:hdr xmlns:wpc="http://schemas.microsoft.com/office/word/2010/wordprocessingCanvas" xmlns:cx="http://schemas.microsoft.com/office/drawing/2014/chartex" xmlns:cx1="http://schemas.microsoft.com/office/drawing/2015/9/8/chartex" xmlns:cx2="http://schemas.microsoft.com/office/drawing/2015/10/21/chartex" xmlns:cx3="http://schemas.microsoft.com/office/drawing/2016/5/9/chartex" xmlns:cx4="http://schemas.microsoft.com/office/drawing/2016/5/10/chartex" xmlns:cx5="http://schemas.microsoft.com/office/drawing/2016/5/11/chartex" xmlns:cx6="http://schemas.microsoft.com/office/drawing/2016/5/12/chartex" xmlns:cx7="http://schemas.microsoft.com/office/drawing/2016/5/13/chartex" xmlns:cx8="http://schemas.microsoft.com/office/drawing/2016/5/14/chartex" xmlns:mc="http://schemas.openxmlformats.org/markup-compatibility/2006" xmlns:aink="http://schemas.microsoft.com/office/drawing/2016/ink" xmlns:am3d="http://schemas.microsoft.com/office/drawing/2017/model3d" xmlns:o="urn:schemas-microsoft-com:office:office" xmlns:oel="http://schemas.microsoft.com/office/2019/extlst" xmlns:r="http://schemas.openxmlformats.org/officeDocument/2006/relationships" xmlns:m="http://schemas.openxmlformats.org/officeDocument/2006/math" xmlns:v="urn:schemas-microsoft-com:vml" xmlns:wp14="http://schemas.microsoft.com/office/word/2010/wordprocessingDrawing" xmlns:wp="http://schemas.openxmlformats.org/drawingml/2006/wordprocessingDrawing" xmlns:w10="urn:schemas-microsoft-com:office:word" xmlns:w="http://schemas.openxmlformats.org/wordprocessingml/2006/main" xmlns:w14="http://schemas.microsoft.com/office/word/2010/wordml" xmlns:w15="http://schemas.microsoft.com/office/word/2012/wordml" xmlns:w16cex="http://schemas.microsoft.com/office/word/2018/wordml/cex" xmlns:w16cid="http://schemas.microsoft.com/office/word/2016/wordml/cid" xmlns:w16="http://schemas.microsoft.com/office/word/2018/wordml" xmlns:w16du="http://schemas.microsoft.com/office/word/2023/wordml/word16du" xmlns:w16sdtdh="http://schemas.microsoft.com/office/word/2020/wordml/sdtdatahash" xmlns:w16sdtfl="http://schemas.microsoft.com/office/word/2024/wordml/sdtformatlock" xmlns:w16se="http://schemas.microsoft.com/office/word/2015/wordml/symex" xmlns:wpg="http://schemas.microsoft.com/office/word/2010/wordprocessingGroup" xmlns:wpi="http://schemas.microsoft.com/office/word/2010/wordprocessingInk" xmlns:wne="http://schemas.microsoft.com/office/word/2006/wordml" xmlns:wps="http://schemas.microsoft.com/office/word/2010/wordprocessingShape" mc:Ignorable="w14 w15 w16se w16cid w16 w16cex w16sdtdh w16sdtfl w16du wp14">
+  <w:p>
+    <w:pPr>
+      <w:pStyle w:val="Encabezado"/>
+    </w:pPr>
+    <w:r>
+      <w:rPr>
+        <w:noProof/>
+      </w:rPr>
+      <mc:AlternateContent>
+        <mc:Choice Requires="wps">
+          <w:drawing>
+            <wp:anchor distT="0" distB="0" distL="114300" distR="114300" simplePos="0" relativeHeight="251659264" behindDoc="1" locked="0" layoutInCell="1" allowOverlap="1" wp14:anchorId="33E41B47" wp14:editId="08AB9E1A">
+              <wp:simplePos x="0" y="0"/>
+              <wp:positionH relativeFrom="page">
+                <wp:posOffset>457200</wp:posOffset>
+              </wp:positionH>
+              <wp:positionV relativeFrom="page">
+                <wp:posOffset>0</wp:posOffset>
+              </wp:positionV>
+              <wp:extent cx="2093976" cy="8705088"/>
+              <wp:effectExtent l="0" t="0" r="1905" b="1270"/>
+              <wp:wrapNone/>
+              <wp:docPr id="73020014" name="Rectángulo 1"/>
+              <wp:cNvGraphicFramePr/>
+              <a:graphic xmlns:a="http://schemas.openxmlformats.org/drawingml/2006/main">
+                <a:graphicData uri="http://schemas.microsoft.com/office/word/2010/wordprocessingShape">
+                  <wps:wsp>
+                    <wps:cNvSpPr/>
+                    <wps:spPr>
+                      <a:xfrm>
+                        <a:off x="0" y="0"/>
+                        <a:ext cx="2093976" cy="8705088"/>
+                      </a:xfrm>
+                      <a:prstGeom prst="rect">
+                        <a:avLst/>
+                      </a:prstGeom>
+                    </wps:spPr>
+                    <wps:style>
+                      <a:lnRef idx="2">
+                        <a:schemeClr val="accent6"/>
+                      </a:lnRef>
+                      <a:fillRef idx="1">
+                        <a:schemeClr val="lt1"/>
+                      </a:fillRef>
+                      <a:effectRef idx="0">
+                        <a:schemeClr val="accent6"/>
+                      </a:effectRef>
+                      <a:fontRef idx="minor">
+                        <a:schemeClr val="dk1"/>
+                      </a:fontRef>
+                    </wps:style>
+                    <wps:txbx>
+                      <w:txbxContent>
+                        <w:p>
+                          <w:r>
+                            <w:rPr>
+                              <w:noProof/>
+                            </w:rPr>
+                            <w:drawing>
+                              <wp:inline distT="0" distB="0" distL="0" distR="0" wp14:anchorId="76F10CED" wp14:editId="1889C52E">
+                                <wp:extent cx="2397760" cy="1035685"/>
+                                <wp:effectExtent l="0" t="0" r="0" b="0"/>
+                                <wp:docPr id="1777830839" name="Imagen 1777830839"/>
+                                <wp:cNvGraphicFramePr>
+                                  <a:graphicFrameLocks xmlns:a="http://schemas.openxmlformats.org/drawingml/2006/main" noChangeAspect="1"/>
+                                </wp:cNvGraphicFramePr>
+                                <a:graphic xmlns:a="http://schemas.openxmlformats.org/drawingml/2006/main">
+                                  <a:graphicData uri="http://schemas.openxmlformats.org/drawingml/2006/picture">
+                                    <pic:pic xmlns:pic="http://schemas.openxmlformats.org/drawingml/2006/picture">
+                                      <pic:nvPicPr>
+                                        <pic:cNvPr id="2" name="Image2"/>
+                                        <pic:cNvPicPr>
+                                          <a:picLocks noChangeAspect="1" noChangeArrowheads="1"/>
+                                        </pic:cNvPicPr>
+                                      </pic:nvPicPr>
+                                      <pic:blipFill>
+                                        <a:blip r:embed="rId1"/>
+                                        <a:stretch>
+                                          <a:fillRect/>
+                                        </a:stretch>
+                                      </pic:blipFill>
+                                      <pic:spPr bwMode="auto">
+                                        <a:xfrm>
+                                          <a:off x="0" y="0"/>
+                                          <a:ext cx="2397760" cy="1035685"/>
+                                        </a:xfrm>
+                                        <a:prstGeom prst="rect">
+                                          <a:avLst/>
+                                        </a:prstGeom>
+                                        <a:noFill/>
+                                      </pic:spPr>
+                                    </pic:pic>
+                                  </a:graphicData>
+                                </a:graphic>
+                              </wp:inline>
+                            </w:drawing>
+                          </w:r>
+                          <w:r>
+                            <w:rPr>
+                              <w:b/>
+                              <w:i/>
+                              <w:color w:val="612D4B"/>
+                              <w:sz w:val="26"/>
+                            </w:rPr>
+                            <w:t>We create everlasting moments</w:t>
+                          </w:r>
+                        </w:p>
+                        <w:p/>
+                        <w:p>
+                          <w:r>
+                            <w:rPr>
+                              <w:b/>
+                              <w:color w:val="612D4B"/>
+                              <w:sz w:val="24"/>
+                            </w:rPr>
+                            <w:t>Client</w:t>
+                          </w:r>
+                        </w:p>
+                        <w:p>
+                          <w:pPr>
+                            <w:spacing w:after="40"/>
+                            <w:rPr>
+                              <w:rFonts w:ascii="Cambria" w:hAnsi="Cambria"/>
+                              <w:color w:val="000000"/>
+                              <w:sz w:val="18"/>
+                            </w:rPr>
+                          </w:pPr>
+                          <w:r>
+                            <w:rPr>
+                              <w:rFonts w:ascii="Cambria" w:hAnsi="Cambria"/>
+                              <w:color w:val="000000"/>
+                              <w:sz w:val="18"/>
+                            </w:rPr>
+                            <w:t>Rafael Guzman</w:t>
+                          </w:r>
+                        </w:p>
+                        <w:p>
+                          <w:pPr>
+                            <w:spacing w:after="40"/>
+                          </w:pPr>
+                          <w:r>
+                            <w:rPr>
+                              <w:sz w:val="20"/>
+                            </w:rPr>
+                            <w:t>Santo Domingo, DR</w:t>
+                          </w:r>
+                        </w:p>
+                        <w:p>
+                          <w:pPr>
+                            <w:spacing w:after="40"/>
+                          </w:pPr>
+                          <w:r>
+                            <w:rPr>
+                              <w:sz w:val="20"/>
+                            </w:rPr>
+                            <w:t>rafael@example.com</w:t>
+                          </w:r>
+                        </w:p>
+                        <w:p/>
+                        <w:p>
+                          <w:r>
+                            <w:rPr>
+                              <w:b/>
+                              <w:color w:val="612D4B"/>
+                              <w:sz w:val="24"/>
+                            </w:rPr>
+                            <w:t>Client Representative</w:t>
+                          </w:r>
+                        </w:p>
+                        <w:p>
+                          <w:pPr>
+                            <w:spacing w:after="40"/>
+                          </w:pPr>
+                          <w:r>
+                            <w:rPr>
+                              <w:sz w:val="20"/>
+                            </w:rPr>
+                            <w:t>Jane Doe</w:t>
+                          </w:r>
+                        </w:p>
+                        <w:p>
+                          <w:pPr>
+                            <w:spacing w:after="40"/>
+                          </w:pPr>
+                          <w:r>
+                            <w:rPr>
+                              <w:sz w:val="20"/>
+                            </w:rPr>
+                            <w:t>jane@business.com</w:t>
+                          </w:r>
+                        </w:p>
+                        <w:p>
+                          <w:pPr>
+                            <w:spacing w:after="40"/>
+                          </w:pPr>
+                          <w:r>
+                            <w:rPr>
+                              <w:sz w:val="20"/>
+                            </w:rPr>
+                            <w:t>Ph: +1 555-0198</w:t>
+                          </w:r>
+                        </w:p>
+                        <w:p/>
+                        <w:p>
+                          <w:r>
+                            <w:rPr>
+                              <w:b/>
+                              <w:color w:val="612D4B"/>
+                              <w:sz w:val="24"/>
+                            </w:rPr>
+                            <w:t>Event Details</w:t>
+                          </w:r>
+                        </w:p>
+                        <w:p>
+                          <w:pPr>
+                            <w:spacing w:after="40"/>
+                          </w:pPr>
+                          <w:r>
+                            <w:rPr>
+                              <w:sz w:val="20"/>
+                            </w:rPr>
+                            <w:t>789 Event Center Blvd, NY</w:t>
+                          </w:r>
+                        </w:p>
+                        <w:p>
+                          <w:pPr>
+                            <w:spacing w:after="40"/>
+                          </w:pPr>
+                          <w:r>
+                            <w:rPr>
+                              <w:sz w:val="20"/>
+                            </w:rPr>
+                            <w:t>Event Code: EV-2025-099</w:t>
+                          </w:r>
+                        </w:p>
+                        <w:p>
+                          <w:pPr>
+                            <w:spacing w:after="40"/>
+                          </w:pPr>
+                          <w:r>
+                            <w:rPr>
+                              <w:sz w:val="20"/>
+                            </w:rPr>
+                            <w:t>Start: Saturday, October 14th 2025</w:t>
+                          </w:r>
+                        </w:p>
+                        <w:p>
+                          <w:pPr>
+                            <w:spacing w:after="40"/>
+                          </w:pPr>
+                          <w:r>
+                            <w:rPr>
+                              <w:sz w:val="20"/>
+                            </w:rPr>
+                            <w:t>End: Sunday, October 15th 2025</w:t>
+                          </w:r>
+                          <w:r>
+                            <w:rPr>
+                              <w:sz w:val="20"/>
+                            </w:rPr>
+                            <w:br/>
+                            <w:t>200 Guests</w:t>
+                          </w:r>
+                        </w:p>
+                        <w:p>
+                          <w:pPr>
+                            <w:jc w:val="center"/>
+                          </w:pPr>
+                          <w:r>
+                            <w:rPr>
+                              <w:noProof/>
+                            </w:rPr>
+                            <w:drawing>
+                              <wp:inline distT="0" distB="0" distL="0" distR="0" wp14:anchorId="47EEC598" wp14:editId="61D17697">
+                                <wp:extent cx="1532890" cy="1261110"/>
+                                <wp:effectExtent l="0" t="0" r="0" b="0"/>
+                                <wp:docPr id="452091549" name="Imagen 452091549"/>
+                                <wp:cNvGraphicFramePr>
+                                  <a:graphicFrameLocks xmlns:a="http://schemas.openxmlformats.org/drawingml/2006/main" noChangeAspect="1"/>
+                                </wp:cNvGraphicFramePr>
+                                <a:graphic xmlns:a="http://schemas.openxmlformats.org/drawingml/2006/main">
+                                  <a:graphicData uri="http://schemas.openxmlformats.org/drawingml/2006/picture">
+                                    <pic:pic xmlns:pic="http://schemas.openxmlformats.org/drawingml/2006/picture">
+                                      <pic:nvPicPr>
+                                        <pic:cNvPr id="3" name="Image1 Copy 1"/>
+                                        <pic:cNvPicPr>
+                                          <a:picLocks noChangeAspect="1" noChangeArrowheads="1"/>
+                                        </pic:cNvPicPr>
+                                      </pic:nvPicPr>
+                                      <pic:blipFill>
+                                        <a:blip r:embed="rId2"/>
+                                        <a:stretch>
+                                          <a:fillRect/>
+                                        </a:stretch>
+                                      </pic:blipFill>
+                                      <pic:spPr bwMode="auto">
+                                        <a:xfrm>
+                                          <a:off x="0" y="0"/>
+                                          <a:ext cx="1532890" cy="1261110"/>
+                                        </a:xfrm>
+                                        <a:prstGeom prst="rect">
+                                          <a:avLst/>
+                                        </a:prstGeom>
+                                        <a:noFill/>
+                                      </pic:spPr>
+                                    </pic:pic>
+                                  </a:graphicData>
+                                </a:graphic>
+                              </wp:inline>
+                            </w:drawing>
+                          </w:r>
+                        </w:p>
+                      </w:txbxContent>
+                    </wps:txbx>
+                    <wps:bodyPr rot="0" spcFirstLastPara="0" vertOverflow="overflow" horzOverflow="overflow" vert="horz" wrap="square" lIns="91440" tIns="45720" rIns="91440" bIns="45720" numCol="1" spcCol="0" rtlCol="0" fromWordArt="0" anchor="ctr" anchorCtr="0" forceAA="0" compatLnSpc="1">
+                      <a:prstTxWarp prst="textNoShape">
+                        <a:avLst/>
+                      </a:prstTxWarp>
+                      <a:noAutofit/>
+                    </wps:bodyPr>
+                  </wps:wsp>
+                </a:graphicData>
+              </a:graphic>
+              <wp14:sizeRelH relativeFrom="margin">
+                <wp14:pctWidth>0</wp14:pctWidth>
+              </wp14:sizeRelH>
+              <wp14:sizeRelV relativeFrom="margin">
+                <wp14:pctHeight>0</wp14:pctHeight>
+              </wp14:sizeRelV>
+            </wp:anchor>
+          </w:drawing>
+        </mc:Choice>
+        <mc:Fallback>
+          <w:pict>
+            <v:rect w14:anchorId="33E41B47" id="Rectángulo 1" o:spid="_x0000_s1026" style="position:absolute;margin-left:36pt;margin-top:0;width:164.9pt;height:685.45pt;z-index:-251657216;visibility:visible;mso-wrap-style:square;mso-width-percent:0;mso-height-percent:0;mso-wrap-distance-left:9pt;mso-wrap-distance-top:0;mso-wrap-distance-right:9pt;mso-wrap-distance-bottom:0;mso-position-horizontal:absolute;mso-position-horizontal-relative:page;mso-position-vertical:absolute;mso-position-vertical-relative:page;mso-width-percent:0;mso-height-percent:0;mso-width-relative:margin;mso-height-relative:margin;v-text-anchor:middle" o:gfxdata="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" fillcolor="white [3201]" stroked="f" strokeweight="2pt">
+              <v:textbox>
+                <w:txbxContent>
+                  <w:p>
+                    <w:r>
+                      <w:rPr>
+                        <w:noProof/>
+                      </w:rPr>
+                      <w:drawing>
+                        <wp:inline distT="0" distB="0" distL="0" distR="0" wp14:anchorId="76F10CED" wp14:editId="1889C52E">
+                          <wp:extent cx="2397760" cy="1035685"/>
+                          <wp:effectExtent l="0" t="0" r="0" b="0"/>
+                          <wp:docPr id="1777830839" name="Imagen 1777830839"/>
+                          <wp:cNvGraphicFramePr>
+                            <a:graphicFrameLocks xmlns:a="http://schemas.openxmlformats.org/drawingml/2006/main" noChangeAspect="1"/>
+                          </wp:cNvGraphicFramePr>
+                          <a:graphic xmlns:a="http://schemas.openxmlformats.org/drawingml/2006/main">
+                            <a:graphicData uri="http://schemas.openxmlformats.org/drawingml/2006/picture">
+                              <pic:pic xmlns:pic="http://schemas.openxmlformats.org/drawingml/2006/picture">
+                                <pic:nvPicPr>
+                                  <pic:cNvPr id="2" name="Image2"/>
+                                  <pic:cNvPicPr>
+                                    <a:picLocks noChangeAspect="1" noChangeArrowheads="1"/>
+                                  </pic:cNvPicPr>
+                                </pic:nvPicPr>
+                                <pic:blipFill>
+                                  <a:blip r:embed="rId1"/>
+                                  <a:stretch>
+                                    <a:fillRect/>
+                                  </a:stretch>
+                                </pic:blipFill>
+                                <pic:spPr bwMode="auto">
+                                  <a:xfrm>
+                                    <a:off x="0" y="0"/>
+                                    <a:ext cx="2397760" cy="1035685"/>
+                                  </a:xfrm>
+                                  <a:prstGeom prst="rect">
+                                    <a:avLst/>
+                                  </a:prstGeom>
+                                  <a:noFill/>
+                                </pic:spPr>
+                              </pic:pic>
+                            </a:graphicData>
+                          </a:graphic>
+                        </wp:inline>
+                      </w:drawing>
+                    </w:r>
+                    <w:r>
+                      <w:rPr>
+                        <w:b/>
+                        <w:i/>
+                        <w:color w:val="612D4B"/>
+                        <w:sz w:val="26"/>
+                      </w:rPr>
+                      <w:t>We create everlasting moments</w:t>
+                    </w:r>
+                  </w:p>
+                  <w:p/>
+                  <w:p>
+                    <w:r>
+                      <w:rPr>
+                        <w:b/>
+                        <w:color w:val="612D4B"/>
+                        <w:sz w:val="24"/>
+                      </w:rPr>
+                      <w:t>Client</w:t>
+                    </w:r>
+                  </w:p>
+                  <w:p>
+                    <w:pPr>
+                      <w:spacing w:after="40"/>
+                      <w:rPr>
+                        <w:rFonts w:ascii="Cambria" w:hAnsi="Cambria"/>
+                        <w:color w:val="000000"/>
+                        <w:sz w:val="18"/>
+                      </w:rPr>
+                    </w:pPr>
+                    <w:r>
+                      <w:rPr>
+                        <w:rFonts w:ascii="Cambria" w:hAnsi="Cambria"/>
+                        <w:color w:val="000000"/>
+                        <w:sz w:val="18"/>
+                      </w:rPr>
+                      <w:t>Rafael Guzman</w:t>
+                    </w:r>
+                  </w:p>
+                  <w:p>
+                    <w:pPr>
+                      <w:spacing w:after="40"/>
+                    </w:pPr>
+                    <w:r>
+                      <w:rPr>
+                        <w:sz w:val="20"/>
+                      </w:rPr>
+                      <w:t>Santo Domingo, DR</w:t>
+                    </w:r>
+                  </w:p>
+                  <w:p>
+                    <w:pPr>
+                      <w:spacing w:after="40"/>
+                    </w:pPr>
+                    <w:r>
+                      <w:rPr>
+                        <w:sz w:val="20"/>
+                      </w:rPr>
+                      <w:t>rafael@example.com</w:t>
+                    </w:r>
+                  </w:p>
+                  <w:p/>
+                  <w:p>
+                    <w:r>
+                      <w:rPr>
+                        <w:b/>
+                        <w:color w:val="612D4B"/>
+                        <w:sz w:val="24"/>
+                      </w:rPr>
+                      <w:t>Client Representative</w:t>
+                    </w:r>
+                  </w:p>
+                  <w:p>
+                    <w:pPr>
+                      <w:spacing w:after="40"/>
+                    </w:pPr>
+                    <w:r>
+                      <w:rPr>
+                        <w:sz w:val="20"/>
+                      </w:rPr>
+                      <w:t>Jane Doe</w:t>
+                    </w:r>
+                  </w:p>
+                  <w:p>
+                    <w:pPr>
+                      <w:spacing w:after="40"/>
+                    </w:pPr>
+                    <w:r>
+                      <w:rPr>
+                        <w:sz w:val="20"/>
+                      </w:rPr>
+                      <w:t>jane@business.com</w:t>
+                    </w:r>
+                  </w:p>
+                  <w:p>
+                    <w:pPr>
+                      <w:spacing w:after="40"/>
+                    </w:pPr>
+                    <w:r>
+                      <w:rPr>
+                        <w:sz w:val="20"/>
+                      </w:rPr>
+                      <w:t>Ph: +1 555-0198</w:t>
+                    </w:r>
+                  </w:p>
+                  <w:p/>
+                  <w:p>
+                    <w:r>
+                      <w:rPr>
+                        <w:b/>
+                        <w:color w:val="612D4B"/>
+                        <w:sz w:val="24"/>
+                      </w:rPr>
+                      <w:t>Event Details</w:t>
+                    </w:r>
+                  </w:p>
+                  <w:p>
+                    <w:pPr>
+                      <w:spacing w:after="40"/>
+                    </w:pPr>
+                    <w:r>
+                      <w:rPr>
+                        <w:sz w:val="20"/>
+                      </w:rPr>
+                      <w:t>789 Event Center Blvd, NY</w:t>
+                    </w:r>
+                  </w:p>
+                  <w:p>
+                    <w:pPr>
+                      <w:spacing w:after="40"/>
+                    </w:pPr>
+                    <w:r>
+                      <w:rPr>
+                        <w:sz w:val="20"/>
+                      </w:rPr>
+                      <w:t>Event Code: EV-2025-099</w:t>
+                    </w:r>
+                  </w:p>
+                  <w:p>
+                    <w:pPr>
+                      <w:spacing w:after="40"/>
+                    </w:pPr>
+                    <w:r>
+                      <w:rPr>
+                        <w:sz w:val="20"/>
+                      </w:rPr>
+                      <w:t>Start: Saturday, October 14th 2025</w:t>
+                    </w:r>
+                  </w:p>
+                  <w:p>
+                    <w:pPr>
+                      <w:spacing w:after="40"/>
+                    </w:pPr>
+                    <w:r>
+                      <w:rPr>
+                        <w:sz w:val="20"/>
+                      </w:rPr>
+                      <w:t>End: Sunday, October 15th 2025</w:t>
+                    </w:r>
+                    <w:r>
+                      <w:rPr>
+                        <w:sz w:val="20"/>
+                      </w:rPr>
+                      <w:br/>
+                      <w:t>200 Guests</w:t>
+                    </w:r>
+                  </w:p>
+                  <w:p>
+                    <w:pPr>
+                      <w:jc w:val="center"/>
+                    </w:pPr>
+                    <w:r>
+                      <w:rPr>
+                        <w:noProof/>
+                      </w:rPr>
+                      <w:drawing>
+                        <wp:inline distT="0" distB="0" distL="0" distR="0" wp14:anchorId="47EEC598" wp14:editId="61D17697">
+                          <wp:extent cx="1532890" cy="1261110"/>
+                          <wp:effectExtent l="0" t="0" r="0" b="0"/>
+                          <wp:docPr id="452091549" name="Imagen 452091549"/>
+                          <wp:cNvGraphicFramePr>
+                            <a:graphicFrameLocks xmlns:a="http://schemas.openxmlformats.org/drawingml/2006/main" noChangeAspect="1"/>
+                          </wp:cNvGraphicFramePr>
+                          <a:graphic xmlns:a="http://schemas.openxmlformats.org/drawingml/2006/main">
+                            <a:graphicData uri="http://schemas.openxmlformats.org/drawingml/2006/picture">
+                              <pic:pic xmlns:pic="http://schemas.openxmlformats.org/drawingml/2006/picture">
+                                <pic:nvPicPr>
+                                  <pic:cNvPr id="3" name="Image1 Copy 1"/>
+                                  <pic:cNvPicPr>
+                                    <a:picLocks noChangeAspect="1" noChangeArrowheads="1"/>
+                                  </pic:cNvPicPr>
+                                </pic:nvPicPr>
+                                <pic:blipFill>
+                                  <a:blip r:embed="rId2"/>
+                                  <a:stretch>
+                                    <a:fillRect/>
+                                  </a:stretch>
+                                </pic:blipFill>
+                                <pic:spPr bwMode="auto">
+                                  <a:xfrm>
+                                    <a:off x="0" y="0"/>
+                                    <a:ext cx="1532890" cy="1261110"/>
+                                  </a:xfrm>
+                                  <a:prstGeom prst="rect">
+                                    <a:avLst/>
+                                  </a:prstGeom>
+                                  <a:noFill/>
+                                </pic:spPr>
+                              </pic:pic>
+                            </a:graphicData>
+                          </a:graphic>
+                        </wp:inline>
+                      </w:drawing>
+                    </w:r>
+                  </w:p>
+                </w:txbxContent>
+              </v:textbox>
+              <w10:wrap anchorx="page" anchory="page"/>
+            </v:rect>
+          </w:pict>
+        </mc:Fallback>
+      </mc:AlternateContent>
+    </w:r>
+  </w:p>
+</w:hdr>
+</file>
+
+<file path=word/header2.xml><?xml version="1.0" encoding="utf-8"?>
+<w:hdr xmlns:m="http://schemas.openxmlformats.org/officeDocument/2006/math" xmlns:mc="http://schemas.openxmlformats.org/markup-compatibility/2006" xmlns:mo="http://schemas.microsoft.com/office/mac/office/2008/main" xmlns:mv="urn:schemas-microsoft-com:mac:vml" xmlns:o="urn:schemas-microsoft-com:office:office" xmlns:r="http://schemas.openxmlformats.org/officeDocument/2006/relationships" xmlns:v="urn:schemas-microsoft-com:vml" xmlns:w10="urn:schemas-microsoft-com:office:word" xmlns:w14="http://schemas.microsoft.com/office/word/2010/wordml" xmlns:w="http://schemas.openxmlformats.org/wordprocessingml/2006/main" xmlns:wne="http://schemas.microsoft.com/office/word/2006/wordml" xmlns:wp14="http://schemas.microsoft.com/office/word/2010/wordprocessingDrawing" xmlns:wp="http://schemas.openxmlformats.org/drawingml/2006/wordprocessingDrawing" xmlns:wpc="http://schemas.microsoft.com/office/word/2010/wordprocessingCanvas" xmlns:wpg="http://schemas.microsoft.com/office/word/2010/wordprocessingGroup" xmlns:wpi="http://schemas.microsoft.com/office/word/2010/wordprocessingInk" xmlns:wps="http://schemas.microsoft.com/office/word/2010/wordprocessingShape" mc:Ignorable="w14 wp14">
+  <w:p>
+    <w:pPr>
+      <w:pStyle w:val="Header"/>
+    </w:pPr>
+  </w:p>
+</w:hdr>
 </file>
 
 <file path=word/numbering.xml><?xml version="1.0" encoding="utf-8"?>
@@ -3752,6 +3470,7 @@
   <w:style w:type="character" w:default="1" w:styleId="Fuentedeprrafopredeter">
     <w:name w:val="Default Paragraph Font"/>
     <w:uiPriority w:val="1"/>
+    <w:semiHidden/>
     <w:unhideWhenUsed/>
   </w:style>
   <w:style w:type="table" w:default="1" w:styleId="Tablanormal">
@@ -4529,11 +4248,12 @@
   <w:style w:type="paragraph" w:customStyle="1" w:styleId="Default">
     <w:name w:val="Default"/>
     <w:qFormat/>
+    <w:rsid w:val="00FB2E22"/>
     <w:pPr>
-      <w:spacing w:after="200" w:line="276" w:lineRule="auto"/>
+      <w:spacing w:after="200" w:line="336" w:lineRule="auto"/>
     </w:pPr>
     <w:rPr>
-      <w:rFonts w:ascii="Arial" w:eastAsia="MS Mincho" w:hAnsi="Arial"/>
+      <w:rFonts w:ascii="Open Sans Condensed Medium" w:eastAsia="MS Mincho" w:hAnsi="Open Sans Condensed Medium"/>
       <w:color w:val="000000"/>
       <w:sz w:val="24"/>
     </w:rPr>

</xml_diff>